<commit_message>
Complete WordPress Day 1 Assignment
</commit_message>
<xml_diff>
--- a/WordPress/WordPress_Assignment_v2.docx
+++ b/WordPress/WordPress_Assignment_v2.docx
@@ -5,7 +5,7 @@
     <w:p>
       <w:pPr>
         <w:pStyle w:val="Normal"/>
-        <w:spacing w:before="0" w:after="120"/>
+        <w:spacing w:lineRule="auto" w:line="360" w:before="0" w:after="120"/>
         <w:rPr>
           <w:rFonts w:ascii="Times New Roman" w:hAnsi="Times New Roman"/>
           <w:color w:val="000000"/>
@@ -28,7 +28,7 @@
     <w:p>
       <w:pPr>
         <w:pStyle w:val="Normal"/>
-        <w:spacing w:before="0" w:after="120"/>
+        <w:spacing w:lineRule="auto" w:line="360" w:before="0" w:after="120"/>
         <w:rPr>
           <w:rFonts w:ascii="Times New Roman" w:hAnsi="Times New Roman"/>
           <w:color w:val="000000"/>
@@ -74,13 +74,13 @@
           <w:sz w:val="24"/>
           <w:szCs w:val="24"/>
         </w:rPr>
-        <w:t xml:space="preserve"> Control Panel. Click Start on Apache and MySQL. Both should turn green.</w:t>
-      </w:r>
-    </w:p>
-    <w:p>
-      <w:pPr>
-        <w:pStyle w:val="Normal"/>
-        <w:spacing w:before="0" w:after="120"/>
+        <w:t xml:space="preserve"> Control Panel. Start Apache and MySQL. Both should turn green.</w:t>
+      </w:r>
+    </w:p>
+    <w:p>
+      <w:pPr>
+        <w:pStyle w:val="Normal"/>
+        <w:spacing w:lineRule="auto" w:line="360" w:before="0" w:after="120"/>
         <w:rPr>
           <w:rFonts w:ascii="Times New Roman" w:hAnsi="Times New Roman" w:eastAsia="Arial" w:cs="Arial"/>
           <w:color w:val="000000"/>
@@ -96,17 +96,17 @@
           <w:szCs w:val="24"/>
         </w:rPr>
         <w:drawing>
-          <wp:anchor behindDoc="0" distT="0" distB="0" distL="0" distR="0" simplePos="0" locked="0" layoutInCell="0" allowOverlap="1" relativeHeight="2">
+          <wp:anchor behindDoc="0" distT="0" distB="0" distL="0" distR="0" simplePos="0" locked="0" layoutInCell="0" allowOverlap="1" relativeHeight="12">
             <wp:simplePos x="0" y="0"/>
             <wp:positionH relativeFrom="column">
-              <wp:align>center</wp:align>
+              <wp:posOffset>-3175</wp:posOffset>
             </wp:positionH>
             <wp:positionV relativeFrom="paragraph">
               <wp:posOffset>635</wp:posOffset>
             </wp:positionV>
-            <wp:extent cx="5943600" cy="1296670"/>
+            <wp:extent cx="5668645" cy="1236980"/>
             <wp:effectExtent l="0" t="0" r="0" b="0"/>
-            <wp:wrapSquare wrapText="largest"/>
+            <wp:wrapTopAndBottom/>
             <wp:docPr id="1" name="Image1" descr=""/>
             <wp:cNvGraphicFramePr>
               <a:graphicFrameLocks xmlns:a="http://schemas.openxmlformats.org/drawingml/2006/main" noChangeAspect="1"/>
@@ -129,7 +129,7 @@
                   <pic:spPr bwMode="auto">
                     <a:xfrm>
                       <a:off x="0" y="0"/>
-                      <a:ext cx="5943600" cy="1296670"/>
+                      <a:ext cx="5668645" cy="1236980"/>
                     </a:xfrm>
                     <a:prstGeom prst="rect">
                       <a:avLst/>
@@ -146,7 +146,7 @@
     <w:p>
       <w:pPr>
         <w:pStyle w:val="Normal"/>
-        <w:spacing w:before="0" w:after="120"/>
+        <w:spacing w:lineRule="auto" w:line="360" w:before="0" w:after="120"/>
         <w:rPr>
           <w:rFonts w:ascii="Times New Roman" w:hAnsi="Times New Roman"/>
           <w:color w:val="000000"/>
@@ -168,20 +168,13 @@
       <w:r>
         <w:rPr>
           <w:rFonts w:eastAsia="Arial" w:cs="Arial" w:ascii="Times New Roman" w:hAnsi="Times New Roman"/>
-          <w:color w:val="000000"/>
-          <w:sz w:val="24"/>
-          <w:szCs w:val="24"/>
-        </w:rPr>
-        <w:t xml:space="preserve">Open </w:t>
-      </w:r>
-      <w:r>
-        <w:rPr>
-          <w:rFonts w:eastAsia="Arial" w:cs="Arial" w:ascii="Times New Roman" w:hAnsi="Times New Roman"/>
-          <w:color w:val="000000"/>
-          <w:sz w:val="24"/>
-          <w:szCs w:val="24"/>
-        </w:rPr>
-        <w:t>browser and g</w:t>
+          <w:b/>
+          <w:bCs/>
+          <w:color w:val="000000"/>
+          <w:sz w:val="24"/>
+          <w:szCs w:val="24"/>
+        </w:rPr>
+        <w:t>G</w:t>
       </w:r>
       <w:r>
         <w:rPr>
@@ -207,7 +200,31 @@
     <w:p>
       <w:pPr>
         <w:pStyle w:val="Normal"/>
-        <w:spacing w:before="0" w:after="120"/>
+        <w:spacing w:lineRule="auto" w:line="360" w:before="0" w:after="120"/>
+        <w:rPr>
+          <w:rFonts w:ascii="Times New Roman" w:hAnsi="Times New Roman" w:eastAsia="Arial" w:cs="Arial"/>
+          <w:b/>
+          <w:bCs/>
+          <w:color w:val="000000"/>
+          <w:sz w:val="24"/>
+          <w:szCs w:val="24"/>
+        </w:rPr>
+      </w:pPr>
+      <w:r>
+        <w:rPr>
+          <w:rFonts w:eastAsia="Arial" w:cs="Arial" w:ascii="Times New Roman" w:hAnsi="Times New Roman"/>
+          <w:b/>
+          <w:bCs/>
+          <w:color w:val="000000"/>
+          <w:sz w:val="24"/>
+          <w:szCs w:val="24"/>
+        </w:rPr>
+      </w:r>
+    </w:p>
+    <w:p>
+      <w:pPr>
+        <w:pStyle w:val="Normal"/>
+        <w:spacing w:lineRule="auto" w:line="360" w:before="0" w:after="120"/>
         <w:rPr>
           <w:rFonts w:ascii="Times New Roman" w:hAnsi="Times New Roman"/>
           <w:color w:val="000000"/>
@@ -217,7 +234,7 @@
       </w:pPr>
       <w:r>
         <w:drawing>
-          <wp:anchor behindDoc="0" distT="0" distB="0" distL="0" distR="0" simplePos="0" locked="0" layoutInCell="0" allowOverlap="1" relativeHeight="3">
+          <wp:anchor behindDoc="0" distT="0" distB="0" distL="0" distR="0" simplePos="0" locked="0" layoutInCell="0" allowOverlap="1" relativeHeight="2">
             <wp:simplePos x="0" y="0"/>
             <wp:positionH relativeFrom="column">
               <wp:posOffset>-17145</wp:posOffset>
@@ -281,7 +298,34 @@
           <w:sz w:val="24"/>
           <w:szCs w:val="24"/>
         </w:rPr>
-        <w:t xml:space="preserve">Click on 'New' on the left side. Type </w:t>
+        <w:t xml:space="preserve"> </w:t>
+      </w:r>
+      <w:r>
+        <w:rPr>
+          <w:rFonts w:eastAsia="Arial" w:cs="Arial" w:ascii="Times New Roman" w:hAnsi="Times New Roman"/>
+          <w:color w:val="000000"/>
+          <w:sz w:val="24"/>
+          <w:szCs w:val="24"/>
+        </w:rPr>
+        <w:t>Create a new</w:t>
+      </w:r>
+      <w:r>
+        <w:rPr>
+          <w:rFonts w:eastAsia="Arial" w:cs="Arial" w:ascii="Times New Roman" w:hAnsi="Times New Roman"/>
+          <w:color w:val="000000"/>
+          <w:sz w:val="24"/>
+          <w:szCs w:val="24"/>
+        </w:rPr>
+        <w:t xml:space="preserve"> database </w:t>
+      </w:r>
+      <w:r>
+        <w:rPr>
+          <w:rFonts w:eastAsia="Arial" w:cs="Arial" w:ascii="Times New Roman" w:hAnsi="Times New Roman"/>
+          <w:color w:val="000000"/>
+          <w:sz w:val="24"/>
+          <w:szCs w:val="24"/>
+        </w:rPr>
+        <w:t>named “</w:t>
       </w:r>
       <w:r>
         <w:rPr>
@@ -301,13 +345,13 @@
           <w:sz w:val="24"/>
           <w:szCs w:val="24"/>
         </w:rPr>
-        <w:t xml:space="preserve"> as the database name and click Create.</w:t>
-      </w:r>
-    </w:p>
-    <w:p>
-      <w:pPr>
-        <w:pStyle w:val="Normal"/>
-        <w:spacing w:before="0" w:after="120"/>
+        <w:t>”.</w:t>
+      </w:r>
+    </w:p>
+    <w:p>
+      <w:pPr>
+        <w:pStyle w:val="Normal"/>
+        <w:spacing w:lineRule="auto" w:line="360" w:before="0" w:after="120"/>
         <w:rPr>
           <w:rFonts w:ascii="Times New Roman" w:hAnsi="Times New Roman" w:eastAsia="Arial" w:cs="Arial"/>
           <w:color w:val="000000"/>
@@ -327,7 +371,7 @@
     <w:p>
       <w:pPr>
         <w:pStyle w:val="Normal"/>
-        <w:spacing w:before="0" w:after="120"/>
+        <w:spacing w:lineRule="auto" w:line="360" w:before="0" w:after="120"/>
         <w:rPr>
           <w:rFonts w:ascii="Times New Roman" w:hAnsi="Times New Roman"/>
           <w:color w:val="000000"/>
@@ -353,11 +397,67 @@
           <w:sz w:val="24"/>
           <w:szCs w:val="24"/>
         </w:rPr>
-        <w:t xml:space="preserve">Go to wordpress.org, download WordPress, and extract the folder inside C:/xampp/htdocs/. Rename the folder to </w:t>
-      </w:r>
-      <w:r>
-        <w:rPr>
-          <w:rFonts w:eastAsia="Arial" w:cs="Arial" w:ascii="Times New Roman" w:hAnsi="Times New Roman"/>
+        <w:t>Go to wordpress.org, download WordPress, and extract the folder inside C:/xampp/htdocs/.</w:t>
+      </w:r>
+    </w:p>
+    <w:p>
+      <w:pPr>
+        <w:pStyle w:val="Normal"/>
+        <w:spacing w:lineRule="auto" w:line="360" w:before="0" w:after="120"/>
+        <w:rPr>
+          <w:rFonts w:ascii="Times New Roman" w:hAnsi="Times New Roman"/>
+          <w:color w:val="000000"/>
+          <w:sz w:val="24"/>
+          <w:szCs w:val="24"/>
+        </w:rPr>
+      </w:pPr>
+      <w:r>
+        <w:rPr>
+          <w:rFonts w:eastAsia="Arial" w:cs="Arial" w:ascii="Times New Roman" w:hAnsi="Times New Roman"/>
+          <w:b/>
+          <w:bCs/>
+          <w:color w:val="000000"/>
+          <w:sz w:val="24"/>
+          <w:szCs w:val="24"/>
+        </w:rPr>
+        <w:t xml:space="preserve">Step 5: </w:t>
+      </w:r>
+      <w:r>
+        <w:rPr>
+          <w:rFonts w:eastAsia="Arial" w:cs="Arial" w:ascii="Times New Roman" w:hAnsi="Times New Roman"/>
+          <w:b/>
+          <w:bCs/>
+          <w:color w:val="000000"/>
+          <w:sz w:val="24"/>
+          <w:szCs w:val="24"/>
+        </w:rPr>
+        <w:t>G</w:t>
+      </w:r>
+      <w:r>
+        <w:rPr>
+          <w:rFonts w:eastAsia="Arial" w:cs="Arial" w:ascii="Times New Roman" w:hAnsi="Times New Roman"/>
+          <w:color w:val="000000"/>
+          <w:sz w:val="24"/>
+          <w:szCs w:val="24"/>
+        </w:rPr>
+        <w:t xml:space="preserve">o to </w:t>
+      </w:r>
+      <w:r>
+        <w:rPr>
+          <w:rFonts w:eastAsia="Arial" w:cs="Arial" w:ascii="Times New Roman" w:hAnsi="Times New Roman"/>
+          <w:b/>
+          <w:bCs/>
+          <w:color w:val="000000"/>
+          <w:sz w:val="24"/>
+          <w:szCs w:val="24"/>
+        </w:rPr>
+        <w:t>localhost/</w:t>
+      </w:r>
+      <w:r>
+        <w:rPr>
+          <w:rFonts w:eastAsia="Arial" w:cs="Arial" w:ascii="Times New Roman" w:hAnsi="Times New Roman"/>
+          <w:b/>
+          <w:bCs/>
           <w:color w:val="000000"/>
           <w:sz w:val="24"/>
           <w:szCs w:val="24"/>
@@ -371,13 +471,40 @@
           <w:sz w:val="24"/>
           <w:szCs w:val="24"/>
         </w:rPr>
-        <w:t>.</w:t>
-      </w:r>
-    </w:p>
-    <w:p>
-      <w:pPr>
-        <w:pStyle w:val="Normal"/>
-        <w:spacing w:before="0" w:after="120"/>
+        <w:t>. Fill in the database name, username (root), leave password blank, and click Submit.</w:t>
+      </w:r>
+    </w:p>
+    <w:p>
+      <w:pPr>
+        <w:pStyle w:val="Normal"/>
+        <w:spacing w:lineRule="auto" w:line="360" w:before="0" w:after="120"/>
+        <w:rPr>
+          <w:rFonts w:ascii="Times New Roman" w:hAnsi="Times New Roman" w:eastAsia="Arial" w:cs="Arial"/>
+          <w:b/>
+          <w:bCs/>
+          <w:color w:val="000000"/>
+          <w:sz w:val="24"/>
+          <w:szCs w:val="24"/>
+        </w:rPr>
+      </w:pPr>
+      <w:r>
+        <w:rPr>
+          <w:rFonts w:eastAsia="Arial" w:cs="Arial" w:ascii="Times New Roman" w:hAnsi="Times New Roman"/>
+          <w:b/>
+          <w:bCs/>
+          <w:color w:val="000000"/>
+          <w:sz w:val="24"/>
+          <w:szCs w:val="24"/>
+        </w:rPr>
+      </w:r>
+      <w:r>
+        <w:br w:type="page"/>
+      </w:r>
+    </w:p>
+    <w:p>
+      <w:pPr>
+        <w:pStyle w:val="Normal"/>
+        <w:spacing w:lineRule="auto" w:line="360" w:before="0" w:after="120"/>
         <w:rPr>
           <w:rFonts w:ascii="Times New Roman" w:hAnsi="Times New Roman"/>
           <w:color w:val="000000"/>
@@ -394,69 +521,6 @@
           <w:sz w:val="24"/>
           <w:szCs w:val="24"/>
         </w:rPr>
-        <w:t xml:space="preserve">Step 5: </w:t>
-      </w:r>
-      <w:r>
-        <w:rPr>
-          <w:rFonts w:eastAsia="Arial" w:cs="Arial" w:ascii="Times New Roman" w:hAnsi="Times New Roman"/>
-          <w:color w:val="000000"/>
-          <w:sz w:val="24"/>
-          <w:szCs w:val="24"/>
-        </w:rPr>
-        <w:t xml:space="preserve">In browser go to </w:t>
-      </w:r>
-      <w:r>
-        <w:rPr>
-          <w:rFonts w:eastAsia="Arial" w:cs="Arial" w:ascii="Times New Roman" w:hAnsi="Times New Roman"/>
-          <w:b/>
-          <w:bCs/>
-          <w:color w:val="000000"/>
-          <w:sz w:val="24"/>
-          <w:szCs w:val="24"/>
-        </w:rPr>
-        <w:t>localhost/</w:t>
-      </w:r>
-      <w:r>
-        <w:rPr>
-          <w:rFonts w:eastAsia="Arial" w:cs="Arial" w:ascii="Times New Roman" w:hAnsi="Times New Roman"/>
-          <w:b/>
-          <w:bCs/>
-          <w:color w:val="000000"/>
-          <w:sz w:val="24"/>
-          <w:szCs w:val="24"/>
-        </w:rPr>
-        <w:t>wordpress</w:t>
-      </w:r>
-      <w:r>
-        <w:rPr>
-          <w:rFonts w:eastAsia="Arial" w:cs="Arial" w:ascii="Times New Roman" w:hAnsi="Times New Roman"/>
-          <w:color w:val="000000"/>
-          <w:sz w:val="24"/>
-          <w:szCs w:val="24"/>
-        </w:rPr>
-        <w:t>. The WordPress installation screen will open. Fill in the database name, username (root), leave password blank, and click Submit.</w:t>
-      </w:r>
-    </w:p>
-    <w:p>
-      <w:pPr>
-        <w:pStyle w:val="Normal"/>
-        <w:spacing w:before="0" w:after="120"/>
-        <w:rPr>
-          <w:rFonts w:ascii="Times New Roman" w:hAnsi="Times New Roman"/>
-          <w:color w:val="000000"/>
-          <w:sz w:val="24"/>
-          <w:szCs w:val="24"/>
-        </w:rPr>
-      </w:pPr>
-      <w:r>
-        <w:rPr>
-          <w:rFonts w:eastAsia="Arial" w:cs="Arial" w:ascii="Times New Roman" w:hAnsi="Times New Roman"/>
-          <w:b/>
-          <w:bCs/>
-          <w:color w:val="000000"/>
-          <w:sz w:val="24"/>
-          <w:szCs w:val="24"/>
-        </w:rPr>
         <w:t xml:space="preserve">Step </w:t>
       </w:r>
       <w:r>
@@ -512,7 +576,7 @@
     <w:p>
       <w:pPr>
         <w:pStyle w:val="Normal"/>
-        <w:spacing w:before="0" w:after="120"/>
+        <w:spacing w:lineRule="auto" w:line="360" w:before="0" w:after="120"/>
         <w:rPr>
           <w:rFonts w:ascii="Times New Roman" w:hAnsi="Times New Roman" w:eastAsia="Arial" w:cs="Arial"/>
           <w:color w:val="000000"/>
@@ -528,7 +592,7 @@
           <w:szCs w:val="24"/>
         </w:rPr>
         <w:drawing>
-          <wp:anchor behindDoc="0" distT="0" distB="0" distL="0" distR="0" simplePos="0" locked="0" layoutInCell="0" allowOverlap="1" relativeHeight="4">
+          <wp:anchor behindDoc="0" distT="0" distB="0" distL="0" distR="0" simplePos="0" locked="0" layoutInCell="0" allowOverlap="1" relativeHeight="3">
             <wp:simplePos x="0" y="0"/>
             <wp:positionH relativeFrom="column">
               <wp:posOffset>-16510</wp:posOffset>
@@ -536,9 +600,9 @@
             <wp:positionV relativeFrom="paragraph">
               <wp:posOffset>29210</wp:posOffset>
             </wp:positionV>
-            <wp:extent cx="1833245" cy="1888490"/>
+            <wp:extent cx="3068320" cy="3161030"/>
             <wp:effectExtent l="0" t="0" r="0" b="0"/>
-            <wp:wrapSquare wrapText="largest"/>
+            <wp:wrapTopAndBottom/>
             <wp:docPr id="3" name="Image3" descr=""/>
             <wp:cNvGraphicFramePr>
               <a:graphicFrameLocks xmlns:a="http://schemas.openxmlformats.org/drawingml/2006/main" noChangeAspect="1"/>
@@ -561,7 +625,7 @@
                   <pic:spPr bwMode="auto">
                     <a:xfrm>
                       <a:off x="0" y="0"/>
-                      <a:ext cx="1833245" cy="1888490"/>
+                      <a:ext cx="3068320" cy="3161030"/>
                     </a:xfrm>
                     <a:prstGeom prst="rect">
                       <a:avLst/>
@@ -574,15 +638,15 @@
           </wp:anchor>
         </w:drawing>
         <w:drawing>
-          <wp:anchor behindDoc="0" distT="0" distB="0" distL="0" distR="0" simplePos="0" locked="0" layoutInCell="0" allowOverlap="1" relativeHeight="5">
+          <wp:anchor behindDoc="0" distT="0" distB="0" distL="0" distR="0" simplePos="0" locked="0" layoutInCell="0" allowOverlap="1" relativeHeight="4">
             <wp:simplePos x="0" y="0"/>
             <wp:positionH relativeFrom="column">
-              <wp:posOffset>1894205</wp:posOffset>
+              <wp:posOffset>-29210</wp:posOffset>
             </wp:positionH>
             <wp:positionV relativeFrom="paragraph">
-              <wp:posOffset>31750</wp:posOffset>
+              <wp:posOffset>3301365</wp:posOffset>
             </wp:positionV>
-            <wp:extent cx="3962400" cy="2472055"/>
+            <wp:extent cx="5557520" cy="3467100"/>
             <wp:effectExtent l="0" t="0" r="0" b="0"/>
             <wp:wrapSquare wrapText="largest"/>
             <wp:docPr id="4" name="Image4" descr=""/>
@@ -607,7 +671,7 @@
                   <pic:spPr bwMode="auto">
                     <a:xfrm>
                       <a:off x="0" y="0"/>
-                      <a:ext cx="3962400" cy="2472055"/>
+                      <a:ext cx="5557520" cy="3467100"/>
                     </a:xfrm>
                     <a:prstGeom prst="rect">
                       <a:avLst/>
@@ -624,6 +688,7 @@
     <w:p>
       <w:pPr>
         <w:pStyle w:val="Normal"/>
+        <w:spacing w:lineRule="auto" w:line="360"/>
         <w:rPr>
           <w:rFonts w:ascii="Times New Roman" w:hAnsi="Times New Roman"/>
           <w:color w:val="000000"/>
@@ -646,7 +711,7 @@
     <w:p>
       <w:pPr>
         <w:pStyle w:val="Normal"/>
-        <w:spacing w:before="0" w:after="120"/>
+        <w:spacing w:lineRule="auto" w:line="360" w:before="0" w:after="120"/>
         <w:rPr>
           <w:rFonts w:ascii="Times New Roman" w:hAnsi="Times New Roman"/>
           <w:color w:val="000000"/>
@@ -669,7 +734,7 @@
     <w:p>
       <w:pPr>
         <w:pStyle w:val="Normal"/>
-        <w:spacing w:before="0" w:after="240"/>
+        <w:spacing w:lineRule="auto" w:line="360" w:before="0" w:after="240"/>
         <w:rPr>
           <w:rFonts w:ascii="Times New Roman" w:hAnsi="Times New Roman"/>
           <w:color w:val="000000"/>
@@ -744,7 +809,7 @@
     <w:p>
       <w:pPr>
         <w:pStyle w:val="Normal"/>
-        <w:spacing w:before="0" w:after="120"/>
+        <w:spacing w:lineRule="auto" w:line="360" w:before="0" w:after="120"/>
         <w:rPr>
           <w:rFonts w:ascii="Times New Roman" w:hAnsi="Times New Roman"/>
           <w:color w:val="000000"/>
@@ -805,7 +870,7 @@
     <w:p>
       <w:pPr>
         <w:pStyle w:val="Normal"/>
-        <w:spacing w:before="0" w:after="120"/>
+        <w:spacing w:lineRule="auto" w:line="360" w:before="0" w:after="120"/>
         <w:rPr>
           <w:rFonts w:ascii="Times New Roman" w:hAnsi="Times New Roman"/>
           <w:color w:val="000000"/>
@@ -834,101 +899,10 @@
         <w:t>Open LocalWP.  Click the + button to create a new site.</w:t>
       </w:r>
     </w:p>
-    <w:tbl>
-      <w:tblPr>
-        <w:tblW w:w="9360" w:type="dxa"/>
-        <w:jc w:val="left"/>
-        <w:tblInd w:w="0" w:type="dxa"/>
-        <w:tblLayout w:type="fixed"/>
-        <w:tblCellMar>
-          <w:top w:w="200" w:type="dxa"/>
-          <w:left w:w="200" w:type="dxa"/>
-          <w:bottom w:w="200" w:type="dxa"/>
-          <w:right w:w="200" w:type="dxa"/>
-        </w:tblCellMar>
-      </w:tblPr>
-      <w:tblGrid>
-        <w:gridCol w:w="9360"/>
-      </w:tblGrid>
-      <w:tr>
-        <w:trPr/>
-        <w:tc>
-          <w:tcPr>
-            <w:tcW w:w="9360" w:type="dxa"/>
-            <w:tcBorders>
-              <w:top w:val="single" w:sz="2" w:space="0" w:color="1A6B8A"/>
-              <w:left w:val="single" w:sz="2" w:space="0" w:color="1A6B8A"/>
-              <w:bottom w:val="single" w:sz="2" w:space="0" w:color="1A6B8A"/>
-              <w:right w:val="single" w:sz="2" w:space="0" w:color="1A6B8A"/>
-            </w:tcBorders>
-            <w:shd w:fill="EAF4FB" w:val="clear"/>
-          </w:tcPr>
-          <w:p>
-            <w:pPr>
-              <w:pStyle w:val="Normal"/>
-              <w:spacing w:before="400" w:after="80"/>
-              <w:jc w:val="center"/>
-              <w:rPr>
-                <w:rFonts w:ascii="Times New Roman" w:hAnsi="Times New Roman"/>
-                <w:color w:val="000000"/>
-                <w:sz w:val="24"/>
-                <w:szCs w:val="24"/>
-              </w:rPr>
-            </w:pPr>
-            <w:r>
-              <w:rPr>
-                <w:rFonts w:eastAsia="Arial" w:cs="Arial" w:ascii="Times New Roman" w:hAnsi="Times New Roman"/>
-                <w:b/>
-                <w:bCs/>
-                <w:color w:val="000000"/>
-                <w:sz w:val="24"/>
-                <w:szCs w:val="24"/>
-              </w:rPr>
-              <w:t xml:space="preserve">📸 </w:t>
-            </w:r>
-            <w:r>
-              <w:rPr>
-                <w:rFonts w:eastAsia="Arial" w:cs="Arial" w:ascii="Times New Roman" w:hAnsi="Times New Roman"/>
-                <w:b/>
-                <w:bCs/>
-                <w:color w:val="000000"/>
-                <w:sz w:val="24"/>
-                <w:szCs w:val="24"/>
-              </w:rPr>
-              <w:t>SCREENSHOT HERE</w:t>
-            </w:r>
-          </w:p>
-          <w:p>
-            <w:pPr>
-              <w:pStyle w:val="Normal"/>
-              <w:spacing w:before="0" w:after="400"/>
-              <w:jc w:val="center"/>
-              <w:rPr>
-                <w:rFonts w:ascii="Times New Roman" w:hAnsi="Times New Roman"/>
-                <w:color w:val="000000"/>
-                <w:sz w:val="24"/>
-                <w:szCs w:val="24"/>
-              </w:rPr>
-            </w:pPr>
-            <w:r>
-              <w:rPr>
-                <w:rFonts w:eastAsia="Arial" w:cs="Arial" w:ascii="Times New Roman" w:hAnsi="Times New Roman"/>
-                <w:i/>
-                <w:iCs/>
-                <w:color w:val="000000"/>
-                <w:sz w:val="24"/>
-                <w:szCs w:val="24"/>
-              </w:rPr>
-              <w:t>LocalWP app home screen</w:t>
-            </w:r>
-          </w:p>
-        </w:tc>
-      </w:tr>
-    </w:tbl>
-    <w:p>
-      <w:pPr>
-        <w:pStyle w:val="Normal"/>
-        <w:spacing w:before="0" w:after="160"/>
+    <w:p>
+      <w:pPr>
+        <w:pStyle w:val="Normal"/>
+        <w:spacing w:lineRule="auto" w:line="360" w:before="0" w:after="120"/>
         <w:rPr>
           <w:rFonts w:ascii="Times New Roman" w:hAnsi="Times New Roman"/>
           <w:color w:val="000000"/>
@@ -938,17 +912,101 @@
       </w:pPr>
       <w:r>
         <w:rPr>
+          <w:rFonts w:eastAsia="Arial" w:cs="Arial" w:ascii="Times New Roman" w:hAnsi="Times New Roman"/>
+          <w:b/>
+          <w:bCs/>
+          <w:color w:val="000000"/>
+          <w:sz w:val="24"/>
+          <w:szCs w:val="24"/>
+        </w:rPr>
+        <w:t xml:space="preserve">Step 3: </w:t>
+      </w:r>
+      <w:r>
+        <w:rPr>
+          <w:rFonts w:eastAsia="Arial" w:cs="Arial" w:ascii="Times New Roman" w:hAnsi="Times New Roman"/>
+          <w:color w:val="000000"/>
+          <w:sz w:val="24"/>
+          <w:szCs w:val="24"/>
+        </w:rPr>
+        <w:t xml:space="preserve">Type a site name </w:t>
+      </w:r>
+      <w:r>
+        <w:rPr>
+          <w:rFonts w:eastAsia="Arial" w:cs="Arial" w:ascii="Times New Roman" w:hAnsi="Times New Roman"/>
+          <w:color w:val="000000"/>
+          <w:sz w:val="24"/>
+          <w:szCs w:val="24"/>
+        </w:rPr>
+        <w:t>(eg. Outside-Day1-Sandhya)</w:t>
+      </w:r>
+      <w:r>
+        <w:rPr>
+          <w:rFonts w:eastAsia="Arial" w:cs="Arial" w:ascii="Times New Roman" w:hAnsi="Times New Roman"/>
+          <w:color w:val="000000"/>
+          <w:sz w:val="24"/>
+          <w:szCs w:val="24"/>
+        </w:rPr>
+        <w:t>. Click Continue.</w:t>
+      </w:r>
+    </w:p>
+    <w:p>
+      <w:pPr>
+        <w:pStyle w:val="Normal"/>
+        <w:spacing w:lineRule="auto" w:line="360" w:before="0" w:after="120"/>
+        <w:rPr>
           <w:rFonts w:ascii="Times New Roman" w:hAnsi="Times New Roman"/>
           <w:color w:val="000000"/>
           <w:sz w:val="24"/>
           <w:szCs w:val="24"/>
         </w:rPr>
-      </w:r>
-    </w:p>
-    <w:p>
-      <w:pPr>
-        <w:pStyle w:val="Normal"/>
-        <w:spacing w:before="0" w:after="120"/>
+      </w:pPr>
+      <w:r>
+        <w:rPr>
+          <w:rFonts w:eastAsia="Arial" w:cs="Arial" w:ascii="Times New Roman" w:hAnsi="Times New Roman"/>
+          <w:b/>
+          <w:bCs/>
+          <w:color w:val="000000"/>
+          <w:sz w:val="24"/>
+          <w:szCs w:val="24"/>
+        </w:rPr>
+        <w:t xml:space="preserve">Step </w:t>
+      </w:r>
+      <w:r>
+        <w:rPr>
+          <w:rFonts w:eastAsia="Arial" w:cs="Arial" w:ascii="Times New Roman" w:hAnsi="Times New Roman"/>
+          <w:b/>
+          <w:bCs/>
+          <w:color w:val="000000"/>
+          <w:sz w:val="24"/>
+          <w:szCs w:val="24"/>
+        </w:rPr>
+        <w:t>4</w:t>
+      </w:r>
+      <w:r>
+        <w:rPr>
+          <w:rFonts w:eastAsia="Arial" w:cs="Arial" w:ascii="Times New Roman" w:hAnsi="Times New Roman"/>
+          <w:b/>
+          <w:bCs/>
+          <w:color w:val="000000"/>
+          <w:sz w:val="24"/>
+          <w:szCs w:val="24"/>
+        </w:rPr>
+        <w:t xml:space="preserve">: </w:t>
+      </w:r>
+      <w:r>
+        <w:rPr>
+          <w:rFonts w:eastAsia="Arial" w:cs="Arial" w:ascii="Times New Roman" w:hAnsi="Times New Roman"/>
+          <w:color w:val="000000"/>
+          <w:sz w:val="24"/>
+          <w:szCs w:val="24"/>
+        </w:rPr>
+        <w:t>Enter an admin username and password. Click Add Site.</w:t>
+      </w:r>
+    </w:p>
+    <w:p>
+      <w:pPr>
+        <w:pStyle w:val="Normal"/>
+        <w:spacing w:lineRule="auto" w:line="360" w:before="0" w:after="120"/>
         <w:rPr>
           <w:rFonts w:ascii="Times New Roman" w:hAnsi="Times New Roman"/>
           <w:color w:val="000000"/>
@@ -965,213 +1023,6 @@
           <w:sz w:val="24"/>
           <w:szCs w:val="24"/>
         </w:rPr>
-        <w:t xml:space="preserve">Step 3: </w:t>
-      </w:r>
-      <w:r>
-        <w:rPr>
-          <w:rFonts w:eastAsia="Arial" w:cs="Arial" w:ascii="Times New Roman" w:hAnsi="Times New Roman"/>
-          <w:color w:val="000000"/>
-          <w:sz w:val="24"/>
-          <w:szCs w:val="24"/>
-        </w:rPr>
-        <w:t>Type a site name (e.g. mylocal). Click Continue.</w:t>
-      </w:r>
-    </w:p>
-    <w:p>
-      <w:pPr>
-        <w:pStyle w:val="Normal"/>
-        <w:spacing w:before="0" w:after="120"/>
-        <w:rPr>
-          <w:rFonts w:ascii="Times New Roman" w:hAnsi="Times New Roman"/>
-          <w:color w:val="000000"/>
-          <w:sz w:val="24"/>
-          <w:szCs w:val="24"/>
-        </w:rPr>
-      </w:pPr>
-      <w:r>
-        <w:rPr>
-          <w:rFonts w:eastAsia="Arial" w:cs="Arial" w:ascii="Times New Roman" w:hAnsi="Times New Roman"/>
-          <w:b/>
-          <w:bCs/>
-          <w:color w:val="000000"/>
-          <w:sz w:val="24"/>
-          <w:szCs w:val="24"/>
-        </w:rPr>
-        <w:t xml:space="preserve">Step 4: </w:t>
-      </w:r>
-      <w:r>
-        <w:rPr>
-          <w:rFonts w:eastAsia="Arial" w:cs="Arial" w:ascii="Times New Roman" w:hAnsi="Times New Roman"/>
-          <w:color w:val="000000"/>
-          <w:sz w:val="24"/>
-          <w:szCs w:val="24"/>
-        </w:rPr>
-        <w:t>Keep the default PHP and MySQL version. Click Continue.</w:t>
-      </w:r>
-    </w:p>
-    <w:p>
-      <w:pPr>
-        <w:pStyle w:val="Normal"/>
-        <w:spacing w:before="0" w:after="120"/>
-        <w:rPr>
-          <w:rFonts w:ascii="Times New Roman" w:hAnsi="Times New Roman"/>
-          <w:color w:val="000000"/>
-          <w:sz w:val="24"/>
-          <w:szCs w:val="24"/>
-        </w:rPr>
-      </w:pPr>
-      <w:r>
-        <w:rPr>
-          <w:rFonts w:eastAsia="Arial" w:cs="Arial" w:ascii="Times New Roman" w:hAnsi="Times New Roman"/>
-          <w:b/>
-          <w:bCs/>
-          <w:color w:val="000000"/>
-          <w:sz w:val="24"/>
-          <w:szCs w:val="24"/>
-        </w:rPr>
-        <w:t xml:space="preserve">Step 5: </w:t>
-      </w:r>
-      <w:r>
-        <w:rPr>
-          <w:rFonts w:eastAsia="Arial" w:cs="Arial" w:ascii="Times New Roman" w:hAnsi="Times New Roman"/>
-          <w:color w:val="000000"/>
-          <w:sz w:val="24"/>
-          <w:szCs w:val="24"/>
-        </w:rPr>
-        <w:t>Enter an admin username and password. Click Add Site.</w:t>
-      </w:r>
-    </w:p>
-    <w:tbl>
-      <w:tblPr>
-        <w:tblW w:w="9360" w:type="dxa"/>
-        <w:jc w:val="left"/>
-        <w:tblInd w:w="0" w:type="dxa"/>
-        <w:tblLayout w:type="fixed"/>
-        <w:tblCellMar>
-          <w:top w:w="200" w:type="dxa"/>
-          <w:left w:w="200" w:type="dxa"/>
-          <w:bottom w:w="200" w:type="dxa"/>
-          <w:right w:w="200" w:type="dxa"/>
-        </w:tblCellMar>
-      </w:tblPr>
-      <w:tblGrid>
-        <w:gridCol w:w="9360"/>
-      </w:tblGrid>
-      <w:tr>
-        <w:trPr/>
-        <w:tc>
-          <w:tcPr>
-            <w:tcW w:w="9360" w:type="dxa"/>
-            <w:tcBorders>
-              <w:top w:val="single" w:sz="2" w:space="0" w:color="1A6B8A"/>
-              <w:left w:val="single" w:sz="2" w:space="0" w:color="1A6B8A"/>
-              <w:bottom w:val="single" w:sz="2" w:space="0" w:color="1A6B8A"/>
-              <w:right w:val="single" w:sz="2" w:space="0" w:color="1A6B8A"/>
-            </w:tcBorders>
-            <w:shd w:fill="EAF4FB" w:val="clear"/>
-          </w:tcPr>
-          <w:p>
-            <w:pPr>
-              <w:pStyle w:val="Normal"/>
-              <w:spacing w:before="400" w:after="80"/>
-              <w:jc w:val="center"/>
-              <w:rPr>
-                <w:rFonts w:ascii="Times New Roman" w:hAnsi="Times New Roman"/>
-                <w:color w:val="000000"/>
-                <w:sz w:val="24"/>
-                <w:szCs w:val="24"/>
-              </w:rPr>
-            </w:pPr>
-            <w:r>
-              <w:rPr>
-                <w:rFonts w:eastAsia="Arial" w:cs="Arial" w:ascii="Times New Roman" w:hAnsi="Times New Roman"/>
-                <w:b/>
-                <w:bCs/>
-                <w:color w:val="000000"/>
-                <w:sz w:val="24"/>
-                <w:szCs w:val="24"/>
-              </w:rPr>
-              <w:t xml:space="preserve">📸 </w:t>
-            </w:r>
-            <w:r>
-              <w:rPr>
-                <w:rFonts w:eastAsia="Arial" w:cs="Arial" w:ascii="Times New Roman" w:hAnsi="Times New Roman"/>
-                <w:b/>
-                <w:bCs/>
-                <w:color w:val="000000"/>
-                <w:sz w:val="24"/>
-                <w:szCs w:val="24"/>
-              </w:rPr>
-              <w:t>SCREENSHOT HERE</w:t>
-            </w:r>
-          </w:p>
-          <w:p>
-            <w:pPr>
-              <w:pStyle w:val="Normal"/>
-              <w:spacing w:before="0" w:after="400"/>
-              <w:jc w:val="center"/>
-              <w:rPr>
-                <w:rFonts w:ascii="Times New Roman" w:hAnsi="Times New Roman"/>
-                <w:color w:val="000000"/>
-                <w:sz w:val="24"/>
-                <w:szCs w:val="24"/>
-              </w:rPr>
-            </w:pPr>
-            <w:r>
-              <w:rPr>
-                <w:rFonts w:eastAsia="Arial" w:cs="Arial" w:ascii="Times New Roman" w:hAnsi="Times New Roman"/>
-                <w:i/>
-                <w:iCs/>
-                <w:color w:val="000000"/>
-                <w:sz w:val="24"/>
-                <w:szCs w:val="24"/>
-              </w:rPr>
-              <w:t>LocalWP – Add Site form filled in</w:t>
-            </w:r>
-          </w:p>
-        </w:tc>
-      </w:tr>
-    </w:tbl>
-    <w:p>
-      <w:pPr>
-        <w:pStyle w:val="Normal"/>
-        <w:spacing w:before="0" w:after="160"/>
-        <w:rPr>
-          <w:rFonts w:ascii="Times New Roman" w:hAnsi="Times New Roman"/>
-          <w:color w:val="000000"/>
-          <w:sz w:val="24"/>
-          <w:szCs w:val="24"/>
-        </w:rPr>
-      </w:pPr>
-      <w:r>
-        <w:rPr>
-          <w:rFonts w:ascii="Times New Roman" w:hAnsi="Times New Roman"/>
-          <w:color w:val="000000"/>
-          <w:sz w:val="24"/>
-          <w:szCs w:val="24"/>
-        </w:rPr>
-      </w:r>
-    </w:p>
-    <w:p>
-      <w:pPr>
-        <w:pStyle w:val="Normal"/>
-        <w:spacing w:before="0" w:after="120"/>
-        <w:rPr>
-          <w:rFonts w:ascii="Times New Roman" w:hAnsi="Times New Roman"/>
-          <w:color w:val="000000"/>
-          <w:sz w:val="24"/>
-          <w:szCs w:val="24"/>
-        </w:rPr>
-      </w:pPr>
-      <w:r>
-        <w:rPr>
-          <w:rFonts w:eastAsia="Arial" w:cs="Arial" w:ascii="Times New Roman" w:hAnsi="Times New Roman"/>
-          <w:b/>
-          <w:bCs/>
-          <w:color w:val="000000"/>
-          <w:sz w:val="24"/>
-          <w:szCs w:val="24"/>
-        </w:rPr>
         <w:t xml:space="preserve">Step 6: </w:t>
       </w:r>
       <w:r>
@@ -1202,226 +1053,70 @@
         <w:t xml:space="preserve"> will see it listed. Click Open Site to view it in browser. Click Open Admin to go to the dashboard.</w:t>
       </w:r>
     </w:p>
-    <w:tbl>
-      <w:tblPr>
-        <w:tblW w:w="9360" w:type="dxa"/>
-        <w:jc w:val="left"/>
-        <w:tblInd w:w="0" w:type="dxa"/>
-        <w:tblLayout w:type="fixed"/>
-        <w:tblCellMar>
-          <w:top w:w="200" w:type="dxa"/>
-          <w:left w:w="200" w:type="dxa"/>
-          <w:bottom w:w="200" w:type="dxa"/>
-          <w:right w:w="200" w:type="dxa"/>
-        </w:tblCellMar>
-      </w:tblPr>
-      <w:tblGrid>
-        <w:gridCol w:w="9360"/>
-      </w:tblGrid>
-      <w:tr>
-        <w:trPr/>
-        <w:tc>
-          <w:tcPr>
-            <w:tcW w:w="9360" w:type="dxa"/>
-            <w:tcBorders>
-              <w:top w:val="single" w:sz="2" w:space="0" w:color="1A6B8A"/>
-              <w:left w:val="single" w:sz="2" w:space="0" w:color="1A6B8A"/>
-              <w:bottom w:val="single" w:sz="2" w:space="0" w:color="1A6B8A"/>
-              <w:right w:val="single" w:sz="2" w:space="0" w:color="1A6B8A"/>
-            </w:tcBorders>
-            <w:shd w:fill="EAF4FB" w:val="clear"/>
-          </w:tcPr>
-          <w:p>
-            <w:pPr>
-              <w:pStyle w:val="Normal"/>
-              <w:spacing w:before="400" w:after="80"/>
-              <w:jc w:val="center"/>
-              <w:rPr>
-                <w:rFonts w:ascii="Times New Roman" w:hAnsi="Times New Roman"/>
-                <w:color w:val="000000"/>
-                <w:sz w:val="24"/>
-                <w:szCs w:val="24"/>
-              </w:rPr>
-            </w:pPr>
-            <w:r>
-              <w:rPr>
-                <w:rFonts w:eastAsia="Arial" w:cs="Arial" w:ascii="Times New Roman" w:hAnsi="Times New Roman"/>
-                <w:b/>
-                <w:bCs/>
-                <w:color w:val="000000"/>
-                <w:sz w:val="24"/>
-                <w:szCs w:val="24"/>
-              </w:rPr>
-              <w:t xml:space="preserve">📸 </w:t>
-            </w:r>
-            <w:r>
-              <w:rPr>
-                <w:rFonts w:eastAsia="Arial" w:cs="Arial" w:ascii="Times New Roman" w:hAnsi="Times New Roman"/>
-                <w:b/>
-                <w:bCs/>
-                <w:color w:val="000000"/>
-                <w:sz w:val="24"/>
-                <w:szCs w:val="24"/>
-              </w:rPr>
-              <w:t>SCREENSHOT HERE</w:t>
-            </w:r>
-          </w:p>
-          <w:p>
-            <w:pPr>
-              <w:pStyle w:val="Normal"/>
-              <w:spacing w:before="0" w:after="400"/>
-              <w:jc w:val="center"/>
-              <w:rPr>
-                <w:rFonts w:ascii="Times New Roman" w:hAnsi="Times New Roman"/>
-                <w:color w:val="000000"/>
-                <w:sz w:val="24"/>
-                <w:szCs w:val="24"/>
-              </w:rPr>
-            </w:pPr>
-            <w:r>
-              <w:rPr>
-                <w:rFonts w:eastAsia="Arial" w:cs="Arial" w:ascii="Times New Roman" w:hAnsi="Times New Roman"/>
-                <w:i/>
-                <w:iCs/>
-                <w:color w:val="000000"/>
-                <w:sz w:val="24"/>
-                <w:szCs w:val="24"/>
-              </w:rPr>
-              <w:t>LocalWP – Site listed and running</w:t>
-            </w:r>
-          </w:p>
-        </w:tc>
-      </w:tr>
-    </w:tbl>
-    <w:p>
-      <w:pPr>
-        <w:pStyle w:val="Normal"/>
-        <w:spacing w:before="0" w:after="160"/>
-        <w:rPr>
-          <w:rFonts w:ascii="Times New Roman" w:hAnsi="Times New Roman"/>
-          <w:color w:val="000000"/>
-          <w:sz w:val="24"/>
-          <w:szCs w:val="24"/>
-        </w:rPr>
-      </w:pPr>
-      <w:r>
-        <w:rPr>
-          <w:rFonts w:ascii="Times New Roman" w:hAnsi="Times New Roman"/>
-          <w:color w:val="000000"/>
-          <w:sz w:val="24"/>
-          <w:szCs w:val="24"/>
-        </w:rPr>
-      </w:r>
-    </w:p>
-    <w:tbl>
-      <w:tblPr>
-        <w:tblW w:w="9360" w:type="dxa"/>
-        <w:jc w:val="left"/>
-        <w:tblInd w:w="0" w:type="dxa"/>
-        <w:tblLayout w:type="fixed"/>
-        <w:tblCellMar>
-          <w:top w:w="200" w:type="dxa"/>
-          <w:left w:w="200" w:type="dxa"/>
-          <w:bottom w:w="200" w:type="dxa"/>
-          <w:right w:w="200" w:type="dxa"/>
-        </w:tblCellMar>
-      </w:tblPr>
-      <w:tblGrid>
-        <w:gridCol w:w="9360"/>
-      </w:tblGrid>
-      <w:tr>
-        <w:trPr/>
-        <w:tc>
-          <w:tcPr>
-            <w:tcW w:w="9360" w:type="dxa"/>
-            <w:tcBorders>
-              <w:top w:val="single" w:sz="2" w:space="0" w:color="1A6B8A"/>
-              <w:left w:val="single" w:sz="2" w:space="0" w:color="1A6B8A"/>
-              <w:bottom w:val="single" w:sz="2" w:space="0" w:color="1A6B8A"/>
-              <w:right w:val="single" w:sz="2" w:space="0" w:color="1A6B8A"/>
-            </w:tcBorders>
-            <w:shd w:fill="EAF4FB" w:val="clear"/>
-          </w:tcPr>
-          <w:p>
-            <w:pPr>
-              <w:pStyle w:val="Normal"/>
-              <w:spacing w:before="400" w:after="80"/>
-              <w:jc w:val="center"/>
-              <w:rPr>
-                <w:rFonts w:ascii="Times New Roman" w:hAnsi="Times New Roman"/>
-                <w:color w:val="000000"/>
-                <w:sz w:val="24"/>
-                <w:szCs w:val="24"/>
-              </w:rPr>
-            </w:pPr>
-            <w:r>
-              <w:rPr>
-                <w:rFonts w:eastAsia="Arial" w:cs="Arial" w:ascii="Times New Roman" w:hAnsi="Times New Roman"/>
-                <w:b/>
-                <w:bCs/>
-                <w:color w:val="000000"/>
-                <w:sz w:val="24"/>
-                <w:szCs w:val="24"/>
-              </w:rPr>
-              <w:t xml:space="preserve">📸 </w:t>
-            </w:r>
-            <w:r>
-              <w:rPr>
-                <w:rFonts w:eastAsia="Arial" w:cs="Arial" w:ascii="Times New Roman" w:hAnsi="Times New Roman"/>
-                <w:b/>
-                <w:bCs/>
-                <w:color w:val="000000"/>
-                <w:sz w:val="24"/>
-                <w:szCs w:val="24"/>
-              </w:rPr>
-              <w:t>SCREENSHOT HERE</w:t>
-            </w:r>
-          </w:p>
-          <w:p>
-            <w:pPr>
-              <w:pStyle w:val="Normal"/>
-              <w:spacing w:before="0" w:after="400"/>
-              <w:jc w:val="center"/>
-              <w:rPr>
-                <w:rFonts w:ascii="Times New Roman" w:hAnsi="Times New Roman"/>
-                <w:color w:val="000000"/>
-                <w:sz w:val="24"/>
-                <w:szCs w:val="24"/>
-              </w:rPr>
-            </w:pPr>
-            <w:r>
-              <w:rPr>
-                <w:rFonts w:eastAsia="Arial" w:cs="Arial" w:ascii="Times New Roman" w:hAnsi="Times New Roman"/>
-                <w:i/>
-                <w:iCs/>
-                <w:color w:val="000000"/>
-                <w:sz w:val="24"/>
-                <w:szCs w:val="24"/>
-              </w:rPr>
-              <w:t>WordPress site open in browser from LocalWP</w:t>
-            </w:r>
-          </w:p>
-        </w:tc>
-      </w:tr>
-    </w:tbl>
-    <w:p>
-      <w:pPr>
-        <w:pStyle w:val="Normal"/>
-        <w:spacing w:before="0" w:after="160"/>
-        <w:rPr>
-          <w:rFonts w:ascii="Times New Roman" w:hAnsi="Times New Roman"/>
-          <w:color w:val="000000"/>
-          <w:sz w:val="24"/>
-          <w:szCs w:val="24"/>
-        </w:rPr>
-      </w:pPr>
-      <w:r>
-        <w:rPr>
-          <w:rFonts w:ascii="Times New Roman" w:hAnsi="Times New Roman"/>
-          <w:color w:val="000000"/>
-          <w:sz w:val="24"/>
-          <w:szCs w:val="24"/>
-        </w:rPr>
+    <w:p>
+      <w:pPr>
+        <w:pStyle w:val="Normal"/>
+        <w:spacing w:lineRule="auto" w:line="360" w:before="0" w:after="120"/>
+        <w:rPr>
+          <w:rFonts w:ascii="Times New Roman" w:hAnsi="Times New Roman" w:eastAsia="Arial" w:cs="Arial"/>
+          <w:color w:val="000000"/>
+          <w:sz w:val="24"/>
+          <w:szCs w:val="24"/>
+        </w:rPr>
+      </w:pPr>
+      <w:r>
+        <w:rPr>
+          <w:rFonts w:eastAsia="Arial" w:cs="Arial" w:ascii="Times New Roman" w:hAnsi="Times New Roman"/>
+          <w:color w:val="000000"/>
+          <w:sz w:val="24"/>
+          <w:szCs w:val="24"/>
+        </w:rPr>
+        <w:drawing>
+          <wp:anchor behindDoc="0" distT="0" distB="0" distL="0" distR="0" simplePos="0" locked="0" layoutInCell="0" allowOverlap="1" relativeHeight="11">
+            <wp:simplePos x="0" y="0"/>
+            <wp:positionH relativeFrom="column">
+              <wp:posOffset>31115</wp:posOffset>
+            </wp:positionH>
+            <wp:positionV relativeFrom="paragraph">
+              <wp:posOffset>-57785</wp:posOffset>
+            </wp:positionV>
+            <wp:extent cx="5827395" cy="3378200"/>
+            <wp:effectExtent l="0" t="0" r="0" b="0"/>
+            <wp:wrapSquare wrapText="largest"/>
+            <wp:docPr id="5" name="Image11" descr=""/>
+            <wp:cNvGraphicFramePr>
+              <a:graphicFrameLocks xmlns:a="http://schemas.openxmlformats.org/drawingml/2006/main" noChangeAspect="1"/>
+            </wp:cNvGraphicFramePr>
+            <a:graphic xmlns:a="http://schemas.openxmlformats.org/drawingml/2006/main">
+              <a:graphicData uri="http://schemas.openxmlformats.org/drawingml/2006/picture">
+                <pic:pic xmlns:pic="http://schemas.openxmlformats.org/drawingml/2006/picture">
+                  <pic:nvPicPr>
+                    <pic:cNvPr id="5" name="Image11" descr=""/>
+                    <pic:cNvPicPr>
+                      <a:picLocks noChangeAspect="1" noChangeArrowheads="1"/>
+                    </pic:cNvPicPr>
+                  </pic:nvPicPr>
+                  <pic:blipFill>
+                    <a:blip r:embed="rId6"/>
+                    <a:stretch>
+                      <a:fillRect/>
+                    </a:stretch>
+                  </pic:blipFill>
+                  <pic:spPr bwMode="auto">
+                    <a:xfrm>
+                      <a:off x="0" y="0"/>
+                      <a:ext cx="5827395" cy="3378200"/>
+                    </a:xfrm>
+                    <a:prstGeom prst="rect">
+                      <a:avLst/>
+                    </a:prstGeom>
+                    <a:noFill/>
+                  </pic:spPr>
+                </pic:pic>
+              </a:graphicData>
+            </a:graphic>
+          </wp:anchor>
+        </w:drawing>
       </w:r>
       <w:r>
         <w:br w:type="page"/>
@@ -1430,9 +1125,12 @@
     <w:p>
       <w:pPr>
         <w:pStyle w:val="Normal"/>
-        <w:spacing w:before="0" w:after="120"/>
-        <w:rPr>
-          <w:rFonts w:ascii="Times New Roman" w:hAnsi="Times New Roman"/>
+        <w:bidi w:val="0"/>
+        <w:spacing w:lineRule="auto" w:line="360" w:before="0" w:after="120"/>
+        <w:rPr>
+          <w:rFonts w:ascii="Times New Roman" w:hAnsi="Times New Roman" w:eastAsia="Arial" w:cs="Arial"/>
+          <w:b/>
+          <w:bCs/>
           <w:color w:val="000000"/>
           <w:sz w:val="28"/>
           <w:szCs w:val="28"/>
@@ -1447,6 +1145,123 @@
           <w:sz w:val="28"/>
           <w:szCs w:val="28"/>
         </w:rPr>
+        <w:drawing>
+          <wp:anchor behindDoc="0" distT="0" distB="0" distL="0" distR="0" simplePos="0" locked="0" layoutInCell="0" allowOverlap="1" relativeHeight="18">
+            <wp:simplePos x="0" y="0"/>
+            <wp:positionH relativeFrom="column">
+              <wp:posOffset>-30480</wp:posOffset>
+            </wp:positionH>
+            <wp:positionV relativeFrom="paragraph">
+              <wp:posOffset>2565400</wp:posOffset>
+            </wp:positionV>
+            <wp:extent cx="5850890" cy="3458845"/>
+            <wp:effectExtent l="0" t="0" r="0" b="0"/>
+            <wp:wrapSquare wrapText="largest"/>
+            <wp:docPr id="6" name="Image12" descr=""/>
+            <wp:cNvGraphicFramePr>
+              <a:graphicFrameLocks xmlns:a="http://schemas.openxmlformats.org/drawingml/2006/main" noChangeAspect="1"/>
+            </wp:cNvGraphicFramePr>
+            <a:graphic xmlns:a="http://schemas.openxmlformats.org/drawingml/2006/main">
+              <a:graphicData uri="http://schemas.openxmlformats.org/drawingml/2006/picture">
+                <pic:pic xmlns:pic="http://schemas.openxmlformats.org/drawingml/2006/picture">
+                  <pic:nvPicPr>
+                    <pic:cNvPr id="6" name="Image12" descr=""/>
+                    <pic:cNvPicPr>
+                      <a:picLocks noChangeAspect="1" noChangeArrowheads="1"/>
+                    </pic:cNvPicPr>
+                  </pic:nvPicPr>
+                  <pic:blipFill>
+                    <a:blip r:embed="rId7"/>
+                    <a:stretch>
+                      <a:fillRect/>
+                    </a:stretch>
+                  </pic:blipFill>
+                  <pic:spPr bwMode="auto">
+                    <a:xfrm>
+                      <a:off x="0" y="0"/>
+                      <a:ext cx="5850890" cy="3458845"/>
+                    </a:xfrm>
+                    <a:prstGeom prst="rect">
+                      <a:avLst/>
+                    </a:prstGeom>
+                    <a:noFill/>
+                  </pic:spPr>
+                </pic:pic>
+              </a:graphicData>
+            </a:graphic>
+          </wp:anchor>
+        </w:drawing>
+        <w:drawing>
+          <wp:anchor behindDoc="0" distT="0" distB="0" distL="0" distR="0" simplePos="0" locked="0" layoutInCell="0" allowOverlap="1" relativeHeight="19">
+            <wp:simplePos x="0" y="0"/>
+            <wp:positionH relativeFrom="column">
+              <wp:posOffset>-10160</wp:posOffset>
+            </wp:positionH>
+            <wp:positionV relativeFrom="paragraph">
+              <wp:posOffset>96520</wp:posOffset>
+            </wp:positionV>
+            <wp:extent cx="5180965" cy="2308225"/>
+            <wp:effectExtent l="0" t="0" r="0" b="0"/>
+            <wp:wrapSquare wrapText="largest"/>
+            <wp:docPr id="7" name="Image13" descr=""/>
+            <wp:cNvGraphicFramePr>
+              <a:graphicFrameLocks xmlns:a="http://schemas.openxmlformats.org/drawingml/2006/main" noChangeAspect="1"/>
+            </wp:cNvGraphicFramePr>
+            <a:graphic xmlns:a="http://schemas.openxmlformats.org/drawingml/2006/main">
+              <a:graphicData uri="http://schemas.openxmlformats.org/drawingml/2006/picture">
+                <pic:pic xmlns:pic="http://schemas.openxmlformats.org/drawingml/2006/picture">
+                  <pic:nvPicPr>
+                    <pic:cNvPr id="7" name="Image13" descr=""/>
+                    <pic:cNvPicPr>
+                      <a:picLocks noChangeAspect="1" noChangeArrowheads="1"/>
+                    </pic:cNvPicPr>
+                  </pic:nvPicPr>
+                  <pic:blipFill>
+                    <a:blip r:embed="rId8"/>
+                    <a:stretch>
+                      <a:fillRect/>
+                    </a:stretch>
+                  </pic:blipFill>
+                  <pic:spPr bwMode="auto">
+                    <a:xfrm>
+                      <a:off x="0" y="0"/>
+                      <a:ext cx="5180965" cy="2308225"/>
+                    </a:xfrm>
+                    <a:prstGeom prst="rect">
+                      <a:avLst/>
+                    </a:prstGeom>
+                    <a:noFill/>
+                  </pic:spPr>
+                </pic:pic>
+              </a:graphicData>
+            </a:graphic>
+          </wp:anchor>
+        </w:drawing>
+      </w:r>
+      <w:r>
+        <w:br w:type="page"/>
+      </w:r>
+    </w:p>
+    <w:p>
+      <w:pPr>
+        <w:pStyle w:val="Normal"/>
+        <w:spacing w:lineRule="auto" w:line="360" w:before="0" w:after="120"/>
+        <w:rPr>
+          <w:rFonts w:ascii="Times New Roman" w:hAnsi="Times New Roman"/>
+          <w:color w:val="000000"/>
+          <w:sz w:val="28"/>
+          <w:szCs w:val="28"/>
+        </w:rPr>
+      </w:pPr>
+      <w:r>
+        <w:rPr>
+          <w:rFonts w:eastAsia="Arial" w:cs="Arial" w:ascii="Times New Roman" w:hAnsi="Times New Roman"/>
+          <w:b/>
+          <w:bCs/>
+          <w:color w:val="000000"/>
+          <w:sz w:val="28"/>
+          <w:szCs w:val="28"/>
+        </w:rPr>
         <w:t>Task 3: Exploring the WordPress Dashboard</w:t>
       </w:r>
       <w:r>
@@ -1464,7 +1279,7 @@
     <w:p>
       <w:pPr>
         <w:pStyle w:val="Normal"/>
-        <w:spacing w:before="0" w:after="120"/>
+        <w:spacing w:lineRule="auto" w:line="360" w:before="0" w:after="120"/>
         <w:rPr>
           <w:rFonts w:ascii="Times New Roman" w:hAnsi="Times New Roman"/>
           <w:color w:val="000000"/>
@@ -1490,13 +1305,31 @@
           <w:sz w:val="24"/>
           <w:szCs w:val="24"/>
         </w:rPr>
-        <w:t>Go to your dashboard home. This is the first screen you see after logging in.</w:t>
-      </w:r>
-    </w:p>
-    <w:p>
-      <w:pPr>
-        <w:pStyle w:val="Normal"/>
-        <w:spacing w:before="0" w:after="120"/>
+        <w:t xml:space="preserve">Go to dashboard. This is the first screen </w:t>
+      </w:r>
+      <w:r>
+        <w:rPr>
+          <w:rFonts w:eastAsia="Arial" w:cs="Arial" w:ascii="Times New Roman" w:hAnsi="Times New Roman"/>
+          <w:color w:val="000000"/>
+          <w:sz w:val="24"/>
+          <w:szCs w:val="24"/>
+        </w:rPr>
+        <w:t>we</w:t>
+      </w:r>
+      <w:r>
+        <w:rPr>
+          <w:rFonts w:eastAsia="Arial" w:cs="Arial" w:ascii="Times New Roman" w:hAnsi="Times New Roman"/>
+          <w:color w:val="000000"/>
+          <w:sz w:val="24"/>
+          <w:szCs w:val="24"/>
+        </w:rPr>
+        <w:t xml:space="preserve"> see after logging in.</w:t>
+      </w:r>
+    </w:p>
+    <w:p>
+      <w:pPr>
+        <w:pStyle w:val="Normal"/>
+        <w:spacing w:lineRule="auto" w:line="360" w:before="0" w:after="120"/>
         <w:rPr>
           <w:rFonts w:ascii="Times New Roman" w:hAnsi="Times New Roman" w:eastAsia="Arial" w:cs="Arial"/>
           <w:color w:val="000000"/>
@@ -1512,7 +1345,7 @@
           <w:szCs w:val="24"/>
         </w:rPr>
         <w:drawing>
-          <wp:anchor behindDoc="0" distT="0" distB="0" distL="0" distR="0" simplePos="0" locked="0" layoutInCell="0" allowOverlap="1" relativeHeight="6">
+          <wp:anchor behindDoc="0" distT="0" distB="0" distL="0" distR="0" simplePos="0" locked="0" layoutInCell="0" allowOverlap="1" relativeHeight="5">
             <wp:simplePos x="0" y="0"/>
             <wp:positionH relativeFrom="column">
               <wp:align>center</wp:align>
@@ -1523,7 +1356,7 @@
             <wp:extent cx="5943600" cy="2782570"/>
             <wp:effectExtent l="0" t="0" r="0" b="0"/>
             <wp:wrapSquare wrapText="largest"/>
-            <wp:docPr id="5" name="Image5" descr=""/>
+            <wp:docPr id="8" name="Image5" descr=""/>
             <wp:cNvGraphicFramePr>
               <a:graphicFrameLocks xmlns:a="http://schemas.openxmlformats.org/drawingml/2006/main" noChangeAspect="1"/>
             </wp:cNvGraphicFramePr>
@@ -1531,13 +1364,13 @@
               <a:graphicData uri="http://schemas.openxmlformats.org/drawingml/2006/picture">
                 <pic:pic xmlns:pic="http://schemas.openxmlformats.org/drawingml/2006/picture">
                   <pic:nvPicPr>
-                    <pic:cNvPr id="5" name="Image5" descr=""/>
+                    <pic:cNvPr id="8" name="Image5" descr=""/>
                     <pic:cNvPicPr>
                       <a:picLocks noChangeAspect="1" noChangeArrowheads="1"/>
                     </pic:cNvPicPr>
                   </pic:nvPicPr>
                   <pic:blipFill>
-                    <a:blip r:embed="rId6"/>
+                    <a:blip r:embed="rId9"/>
                     <a:stretch>
                       <a:fillRect/>
                     </a:stretch>
@@ -1562,7 +1395,7 @@
     <w:p>
       <w:pPr>
         <w:pStyle w:val="Normal"/>
-        <w:spacing w:before="0" w:after="120"/>
+        <w:spacing w:lineRule="auto" w:line="360" w:before="0" w:after="120"/>
         <w:rPr>
           <w:rFonts w:ascii="Times New Roman" w:hAnsi="Times New Roman"/>
           <w:color w:val="000000"/>
@@ -1588,13 +1421,31 @@
           <w:sz w:val="24"/>
           <w:szCs w:val="24"/>
         </w:rPr>
-        <w:t>Click Posts on the left menu. You will see all your posts here.</w:t>
-      </w:r>
-    </w:p>
-    <w:p>
-      <w:pPr>
-        <w:pStyle w:val="Normal"/>
-        <w:spacing w:before="0" w:after="120"/>
+        <w:t xml:space="preserve">Click Posts on the left menu. </w:t>
+      </w:r>
+      <w:r>
+        <w:rPr>
+          <w:rFonts w:eastAsia="Arial" w:cs="Arial" w:ascii="Times New Roman" w:hAnsi="Times New Roman"/>
+          <w:color w:val="000000"/>
+          <w:sz w:val="24"/>
+          <w:szCs w:val="24"/>
+        </w:rPr>
+        <w:t>We</w:t>
+      </w:r>
+      <w:r>
+        <w:rPr>
+          <w:rFonts w:eastAsia="Arial" w:cs="Arial" w:ascii="Times New Roman" w:hAnsi="Times New Roman"/>
+          <w:color w:val="000000"/>
+          <w:sz w:val="24"/>
+          <w:szCs w:val="24"/>
+        </w:rPr>
+        <w:t xml:space="preserve"> will see all our posts here.</w:t>
+      </w:r>
+    </w:p>
+    <w:p>
+      <w:pPr>
+        <w:pStyle w:val="Normal"/>
+        <w:spacing w:lineRule="auto" w:line="360" w:before="0" w:after="120"/>
         <w:rPr>
           <w:rFonts w:ascii="Times New Roman" w:hAnsi="Times New Roman" w:eastAsia="Arial" w:cs="Arial"/>
           <w:color w:val="000000"/>
@@ -1610,7 +1461,7 @@
           <w:szCs w:val="24"/>
         </w:rPr>
         <w:drawing>
-          <wp:anchor behindDoc="0" distT="0" distB="0" distL="0" distR="0" simplePos="0" locked="0" layoutInCell="0" allowOverlap="1" relativeHeight="7">
+          <wp:anchor behindDoc="0" distT="0" distB="0" distL="0" distR="0" simplePos="0" locked="0" layoutInCell="0" allowOverlap="1" relativeHeight="6">
             <wp:simplePos x="0" y="0"/>
             <wp:positionH relativeFrom="column">
               <wp:align>center</wp:align>
@@ -1621,7 +1472,7 @@
             <wp:extent cx="5943600" cy="1972945"/>
             <wp:effectExtent l="0" t="0" r="0" b="0"/>
             <wp:wrapSquare wrapText="largest"/>
-            <wp:docPr id="6" name="Image6" descr=""/>
+            <wp:docPr id="9" name="Image6" descr=""/>
             <wp:cNvGraphicFramePr>
               <a:graphicFrameLocks xmlns:a="http://schemas.openxmlformats.org/drawingml/2006/main" noChangeAspect="1"/>
             </wp:cNvGraphicFramePr>
@@ -1629,13 +1480,13 @@
               <a:graphicData uri="http://schemas.openxmlformats.org/drawingml/2006/picture">
                 <pic:pic xmlns:pic="http://schemas.openxmlformats.org/drawingml/2006/picture">
                   <pic:nvPicPr>
-                    <pic:cNvPr id="6" name="Image6" descr=""/>
+                    <pic:cNvPr id="9" name="Image6" descr=""/>
                     <pic:cNvPicPr>
                       <a:picLocks noChangeAspect="1" noChangeArrowheads="1"/>
                     </pic:cNvPicPr>
                   </pic:nvPicPr>
                   <pic:blipFill>
-                    <a:blip r:embed="rId7"/>
+                    <a:blip r:embed="rId10"/>
                     <a:stretch>
                       <a:fillRect/>
                     </a:stretch>
@@ -1660,7 +1511,7 @@
     <w:p>
       <w:pPr>
         <w:pStyle w:val="Normal"/>
-        <w:spacing w:before="0" w:after="120"/>
+        <w:spacing w:lineRule="auto" w:line="360" w:before="0" w:after="120"/>
         <w:rPr>
           <w:rFonts w:ascii="Times New Roman" w:hAnsi="Times New Roman"/>
           <w:color w:val="000000"/>
@@ -1692,7 +1543,7 @@
     <w:p>
       <w:pPr>
         <w:pStyle w:val="Normal"/>
-        <w:spacing w:before="0" w:after="120"/>
+        <w:spacing w:lineRule="auto" w:line="360" w:before="0" w:after="120"/>
         <w:rPr>
           <w:rFonts w:ascii="Times New Roman" w:hAnsi="Times New Roman" w:eastAsia="Arial" w:cs="Arial"/>
           <w:color w:val="000000"/>
@@ -1708,7 +1559,7 @@
           <w:szCs w:val="24"/>
         </w:rPr>
         <w:drawing>
-          <wp:anchor behindDoc="0" distT="0" distB="0" distL="0" distR="0" simplePos="0" locked="0" layoutInCell="0" allowOverlap="1" relativeHeight="8">
+          <wp:anchor behindDoc="0" distT="0" distB="0" distL="0" distR="0" simplePos="0" locked="0" layoutInCell="0" allowOverlap="1" relativeHeight="7">
             <wp:simplePos x="0" y="0"/>
             <wp:positionH relativeFrom="column">
               <wp:posOffset>-14605</wp:posOffset>
@@ -1719,7 +1570,7 @@
             <wp:extent cx="2349500" cy="1732280"/>
             <wp:effectExtent l="0" t="0" r="0" b="0"/>
             <wp:wrapTopAndBottom/>
-            <wp:docPr id="7" name="Image7" descr=""/>
+            <wp:docPr id="10" name="Image7" descr=""/>
             <wp:cNvGraphicFramePr>
               <a:graphicFrameLocks xmlns:a="http://schemas.openxmlformats.org/drawingml/2006/main" noChangeAspect="1"/>
             </wp:cNvGraphicFramePr>
@@ -1727,13 +1578,13 @@
               <a:graphicData uri="http://schemas.openxmlformats.org/drawingml/2006/picture">
                 <pic:pic xmlns:pic="http://schemas.openxmlformats.org/drawingml/2006/picture">
                   <pic:nvPicPr>
-                    <pic:cNvPr id="7" name="Image7" descr=""/>
+                    <pic:cNvPr id="10" name="Image7" descr=""/>
                     <pic:cNvPicPr>
                       <a:picLocks noChangeAspect="1" noChangeArrowheads="1"/>
                     </pic:cNvPicPr>
                   </pic:nvPicPr>
                   <pic:blipFill>
-                    <a:blip r:embed="rId8"/>
+                    <a:blip r:embed="rId11"/>
                     <a:stretch>
                       <a:fillRect/>
                     </a:stretch>
@@ -1758,7 +1609,7 @@
     <w:p>
       <w:pPr>
         <w:pStyle w:val="Normal"/>
-        <w:spacing w:before="0" w:after="120"/>
+        <w:spacing w:lineRule="auto" w:line="360" w:before="0" w:after="120"/>
         <w:rPr>
           <w:rFonts w:ascii="Times New Roman" w:hAnsi="Times New Roman"/>
           <w:color w:val="000000"/>
@@ -1790,7 +1641,7 @@
     <w:p>
       <w:pPr>
         <w:pStyle w:val="Normal"/>
-        <w:spacing w:before="0" w:after="120"/>
+        <w:spacing w:lineRule="auto" w:line="360" w:before="0" w:after="120"/>
         <w:rPr>
           <w:rFonts w:ascii="Times New Roman" w:hAnsi="Times New Roman" w:eastAsia="Arial" w:cs="Arial"/>
           <w:color w:val="000000"/>
@@ -1806,7 +1657,7 @@
           <w:szCs w:val="24"/>
         </w:rPr>
         <w:drawing>
-          <wp:anchor behindDoc="0" distT="0" distB="0" distL="0" distR="0" simplePos="0" locked="0" layoutInCell="0" allowOverlap="1" relativeHeight="9">
+          <wp:anchor behindDoc="0" distT="0" distB="0" distL="0" distR="0" simplePos="0" locked="0" layoutInCell="0" allowOverlap="1" relativeHeight="8">
             <wp:simplePos x="0" y="0"/>
             <wp:positionH relativeFrom="column">
               <wp:posOffset>2540</wp:posOffset>
@@ -1817,7 +1668,7 @@
             <wp:extent cx="4425315" cy="1618615"/>
             <wp:effectExtent l="0" t="0" r="0" b="0"/>
             <wp:wrapTopAndBottom/>
-            <wp:docPr id="8" name="Image8" descr=""/>
+            <wp:docPr id="11" name="Image8" descr=""/>
             <wp:cNvGraphicFramePr>
               <a:graphicFrameLocks xmlns:a="http://schemas.openxmlformats.org/drawingml/2006/main" noChangeAspect="1"/>
             </wp:cNvGraphicFramePr>
@@ -1825,13 +1676,13 @@
               <a:graphicData uri="http://schemas.openxmlformats.org/drawingml/2006/picture">
                 <pic:pic xmlns:pic="http://schemas.openxmlformats.org/drawingml/2006/picture">
                   <pic:nvPicPr>
-                    <pic:cNvPr id="8" name="Image8" descr=""/>
+                    <pic:cNvPr id="11" name="Image8" descr=""/>
                     <pic:cNvPicPr>
                       <a:picLocks noChangeAspect="1" noChangeArrowheads="1"/>
                     </pic:cNvPicPr>
                   </pic:nvPicPr>
                   <pic:blipFill>
-                    <a:blip r:embed="rId9"/>
+                    <a:blip r:embed="rId12"/>
                     <a:stretch>
                       <a:fillRect/>
                     </a:stretch>
@@ -1856,7 +1707,7 @@
     <w:p>
       <w:pPr>
         <w:pStyle w:val="Normal"/>
-        <w:spacing w:before="0" w:after="120"/>
+        <w:spacing w:lineRule="auto" w:line="360" w:before="0" w:after="120"/>
         <w:rPr>
           <w:rFonts w:ascii="Times New Roman" w:hAnsi="Times New Roman"/>
           <w:color w:val="000000"/>
@@ -1882,13 +1733,31 @@
           <w:sz w:val="24"/>
           <w:szCs w:val="24"/>
         </w:rPr>
-        <w:t>Click Plugins on the left menu. You will see all installed plugins.</w:t>
-      </w:r>
-    </w:p>
-    <w:p>
-      <w:pPr>
-        <w:pStyle w:val="Normal"/>
-        <w:spacing w:before="0" w:after="120"/>
+        <w:t xml:space="preserve">Click Plugins on the left menu. </w:t>
+      </w:r>
+      <w:r>
+        <w:rPr>
+          <w:rFonts w:eastAsia="Arial" w:cs="Arial" w:ascii="Times New Roman" w:hAnsi="Times New Roman"/>
+          <w:color w:val="000000"/>
+          <w:sz w:val="24"/>
+          <w:szCs w:val="24"/>
+        </w:rPr>
+        <w:t>We</w:t>
+      </w:r>
+      <w:r>
+        <w:rPr>
+          <w:rFonts w:eastAsia="Arial" w:cs="Arial" w:ascii="Times New Roman" w:hAnsi="Times New Roman"/>
+          <w:color w:val="000000"/>
+          <w:sz w:val="24"/>
+          <w:szCs w:val="24"/>
+        </w:rPr>
+        <w:t xml:space="preserve"> will see all installed plugins.</w:t>
+      </w:r>
+    </w:p>
+    <w:p>
+      <w:pPr>
+        <w:pStyle w:val="Normal"/>
+        <w:spacing w:lineRule="auto" w:line="360" w:before="0" w:after="120"/>
         <w:rPr>
           <w:rFonts w:ascii="Times New Roman" w:hAnsi="Times New Roman" w:eastAsia="Arial" w:cs="Arial"/>
           <w:color w:val="000000"/>
@@ -1904,7 +1773,7 @@
           <w:szCs w:val="24"/>
         </w:rPr>
         <w:drawing>
-          <wp:anchor behindDoc="0" distT="0" distB="0" distL="0" distR="0" simplePos="0" locked="0" layoutInCell="0" allowOverlap="1" relativeHeight="10">
+          <wp:anchor behindDoc="0" distT="0" distB="0" distL="0" distR="0" simplePos="0" locked="0" layoutInCell="0" allowOverlap="1" relativeHeight="9">
             <wp:simplePos x="0" y="0"/>
             <wp:positionH relativeFrom="column">
               <wp:posOffset>-7620</wp:posOffset>
@@ -1915,7 +1784,7 @@
             <wp:extent cx="4434840" cy="1910715"/>
             <wp:effectExtent l="0" t="0" r="0" b="0"/>
             <wp:wrapTopAndBottom/>
-            <wp:docPr id="9" name="Image9" descr=""/>
+            <wp:docPr id="12" name="Image9" descr=""/>
             <wp:cNvGraphicFramePr>
               <a:graphicFrameLocks xmlns:a="http://schemas.openxmlformats.org/drawingml/2006/main" noChangeAspect="1"/>
             </wp:cNvGraphicFramePr>
@@ -1923,13 +1792,13 @@
               <a:graphicData uri="http://schemas.openxmlformats.org/drawingml/2006/picture">
                 <pic:pic xmlns:pic="http://schemas.openxmlformats.org/drawingml/2006/picture">
                   <pic:nvPicPr>
-                    <pic:cNvPr id="9" name="Image9" descr=""/>
+                    <pic:cNvPr id="12" name="Image9" descr=""/>
                     <pic:cNvPicPr>
                       <a:picLocks noChangeAspect="1" noChangeArrowheads="1"/>
                     </pic:cNvPicPr>
                   </pic:nvPicPr>
                   <pic:blipFill>
-                    <a:blip r:embed="rId10"/>
+                    <a:blip r:embed="rId13"/>
                     <a:stretch>
                       <a:fillRect/>
                     </a:stretch>
@@ -1954,7 +1823,7 @@
     <w:p>
       <w:pPr>
         <w:pStyle w:val="Normal"/>
-        <w:spacing w:before="0" w:after="120"/>
+        <w:spacing w:lineRule="auto" w:line="360" w:before="0" w:after="120"/>
         <w:rPr>
           <w:rFonts w:ascii="Times New Roman" w:hAnsi="Times New Roman" w:eastAsia="Arial" w:cs="Arial"/>
           <w:b/>
@@ -1978,7 +1847,34 @@
     <w:p>
       <w:pPr>
         <w:pStyle w:val="Normal"/>
-        <w:spacing w:before="0" w:after="120"/>
+        <w:spacing w:lineRule="auto" w:line="360" w:before="0" w:after="120"/>
+        <w:rPr>
+          <w:rFonts w:ascii="Times New Roman" w:hAnsi="Times New Roman" w:eastAsia="Arial" w:cs="Arial"/>
+          <w:b/>
+          <w:bCs/>
+          <w:color w:val="000000"/>
+          <w:sz w:val="24"/>
+          <w:szCs w:val="24"/>
+        </w:rPr>
+      </w:pPr>
+      <w:r>
+        <w:rPr>
+          <w:rFonts w:eastAsia="Arial" w:cs="Arial" w:ascii="Times New Roman" w:hAnsi="Times New Roman"/>
+          <w:b/>
+          <w:bCs/>
+          <w:color w:val="000000"/>
+          <w:sz w:val="24"/>
+          <w:szCs w:val="24"/>
+        </w:rPr>
+      </w:r>
+      <w:r>
+        <w:br w:type="page"/>
+      </w:r>
+    </w:p>
+    <w:p>
+      <w:pPr>
+        <w:pStyle w:val="Normal"/>
+        <w:spacing w:lineRule="auto" w:line="360" w:before="0" w:after="120"/>
         <w:rPr>
           <w:rFonts w:ascii="Times New Roman" w:hAnsi="Times New Roman"/>
           <w:color w:val="000000"/>
@@ -2004,12 +1900,31 @@
           <w:sz w:val="24"/>
           <w:szCs w:val="24"/>
         </w:rPr>
-        <w:t>Click Settings → General. You can see the site title, timezone, and other settings here.</w:t>
-      </w:r>
-    </w:p>
-    <w:p>
-      <w:pPr>
-        <w:pStyle w:val="Normal"/>
+        <w:t xml:space="preserve">Click Settings → General. </w:t>
+      </w:r>
+      <w:r>
+        <w:rPr>
+          <w:rFonts w:eastAsia="Arial" w:cs="Arial" w:ascii="Times New Roman" w:hAnsi="Times New Roman"/>
+          <w:color w:val="000000"/>
+          <w:sz w:val="24"/>
+          <w:szCs w:val="24"/>
+        </w:rPr>
+        <w:t>We</w:t>
+      </w:r>
+      <w:r>
+        <w:rPr>
+          <w:rFonts w:eastAsia="Arial" w:cs="Arial" w:ascii="Times New Roman" w:hAnsi="Times New Roman"/>
+          <w:color w:val="000000"/>
+          <w:sz w:val="24"/>
+          <w:szCs w:val="24"/>
+        </w:rPr>
+        <w:t xml:space="preserve"> can see the site title, timezone, and other settings here.</w:t>
+      </w:r>
+    </w:p>
+    <w:p>
+      <w:pPr>
+        <w:pStyle w:val="Normal"/>
+        <w:spacing w:lineRule="auto" w:line="360"/>
         <w:rPr>
           <w:rFonts w:ascii="Times New Roman" w:hAnsi="Times New Roman"/>
           <w:color w:val="000000"/>
@@ -2025,7 +1940,7 @@
           <w:szCs w:val="24"/>
         </w:rPr>
         <w:drawing>
-          <wp:anchor behindDoc="0" distT="0" distB="0" distL="0" distR="0" simplePos="0" locked="0" layoutInCell="0" allowOverlap="1" relativeHeight="11">
+          <wp:anchor behindDoc="0" distT="0" distB="0" distL="0" distR="0" simplePos="0" locked="0" layoutInCell="0" allowOverlap="1" relativeHeight="10">
             <wp:simplePos x="0" y="0"/>
             <wp:positionH relativeFrom="column">
               <wp:posOffset>-17145</wp:posOffset>
@@ -2036,7 +1951,7 @@
             <wp:extent cx="4161790" cy="3199130"/>
             <wp:effectExtent l="0" t="0" r="0" b="0"/>
             <wp:wrapSquare wrapText="largest"/>
-            <wp:docPr id="10" name="Image10" descr=""/>
+            <wp:docPr id="13" name="Image10" descr=""/>
             <wp:cNvGraphicFramePr>
               <a:graphicFrameLocks xmlns:a="http://schemas.openxmlformats.org/drawingml/2006/main" noChangeAspect="1"/>
             </wp:cNvGraphicFramePr>
@@ -2044,13 +1959,13 @@
               <a:graphicData uri="http://schemas.openxmlformats.org/drawingml/2006/picture">
                 <pic:pic xmlns:pic="http://schemas.openxmlformats.org/drawingml/2006/picture">
                   <pic:nvPicPr>
-                    <pic:cNvPr id="10" name="Image10" descr=""/>
+                    <pic:cNvPr id="13" name="Image10" descr=""/>
                     <pic:cNvPicPr>
                       <a:picLocks noChangeAspect="1" noChangeArrowheads="1"/>
                     </pic:cNvPicPr>
                   </pic:nvPicPr>
                   <pic:blipFill>
-                    <a:blip r:embed="rId11"/>
+                    <a:blip r:embed="rId14"/>
                     <a:stretch>
                       <a:fillRect/>
                     </a:stretch>
@@ -2078,7 +1993,7 @@
     <w:p>
       <w:pPr>
         <w:pStyle w:val="Normal"/>
-        <w:spacing w:before="0" w:after="120"/>
+        <w:spacing w:lineRule="auto" w:line="360" w:before="0" w:after="120"/>
         <w:rPr>
           <w:rFonts w:ascii="Times New Roman" w:hAnsi="Times New Roman"/>
           <w:color w:val="000000"/>
@@ -2101,7 +2016,7 @@
     <w:p>
       <w:pPr>
         <w:pStyle w:val="Normal"/>
-        <w:spacing w:before="0" w:after="240"/>
+        <w:spacing w:lineRule="auto" w:line="360" w:before="0" w:after="240"/>
         <w:rPr>
           <w:rFonts w:ascii="Times New Roman" w:hAnsi="Times New Roman"/>
           <w:color w:val="000000"/>
@@ -2116,13 +2031,13 @@
           <w:sz w:val="24"/>
           <w:szCs w:val="24"/>
         </w:rPr>
-        <w:t>Nav menus are the navigation links at the top of your website that help visitors go from page to page.</w:t>
-      </w:r>
-    </w:p>
-    <w:p>
-      <w:pPr>
-        <w:pStyle w:val="Normal"/>
-        <w:spacing w:before="0" w:after="120"/>
+        <w:t>Nav menus are the navigation links at the top of our website that help visitors go from page to page.</w:t>
+      </w:r>
+    </w:p>
+    <w:p>
+      <w:pPr>
+        <w:pStyle w:val="Normal"/>
+        <w:spacing w:lineRule="auto" w:line="360" w:before="0" w:after="120"/>
         <w:rPr>
           <w:rFonts w:ascii="Times New Roman" w:hAnsi="Times New Roman"/>
           <w:color w:val="000000"/>
@@ -2148,13 +2063,50 @@
           <w:sz w:val="24"/>
           <w:szCs w:val="24"/>
         </w:rPr>
-        <w:t>In your dashboard, go to Appearance → Menus.</w:t>
-      </w:r>
-    </w:p>
-    <w:p>
-      <w:pPr>
-        <w:pStyle w:val="Normal"/>
-        <w:spacing w:before="0" w:after="120"/>
+        <w:t xml:space="preserve">In dashboard, go to Appearance → </w:t>
+      </w:r>
+      <w:r>
+        <w:rPr>
+          <w:rFonts w:eastAsia="Arial" w:cs="Arial" w:ascii="Times New Roman" w:hAnsi="Times New Roman"/>
+          <w:color w:val="000000"/>
+          <w:sz w:val="24"/>
+          <w:szCs w:val="24"/>
+        </w:rPr>
+        <w:t>Theme/</w:t>
+      </w:r>
+      <w:r>
+        <w:rPr>
+          <w:rFonts w:eastAsia="Arial" w:cs="Arial" w:ascii="Times New Roman" w:hAnsi="Times New Roman"/>
+          <w:color w:val="000000"/>
+          <w:sz w:val="24"/>
+          <w:szCs w:val="24"/>
+        </w:rPr>
+        <w:t>Editor</w:t>
+      </w:r>
+      <w:r>
+        <w:rPr>
+          <w:rFonts w:eastAsia="Arial" w:cs="Arial" w:ascii="Times New Roman" w:hAnsi="Times New Roman"/>
+          <w:color w:val="000000"/>
+          <w:sz w:val="24"/>
+          <w:szCs w:val="24"/>
+        </w:rPr>
+        <w:t xml:space="preserve"> → Navigation Menu</w:t>
+      </w:r>
+      <w:r>
+        <w:rPr>
+          <w:rFonts w:eastAsia="Arial" w:cs="Arial" w:ascii="Times New Roman" w:hAnsi="Times New Roman"/>
+          <w:color w:val="000000"/>
+          <w:sz w:val="24"/>
+          <w:szCs w:val="24"/>
+        </w:rPr>
+        <w:t>.</w:t>
+      </w:r>
+    </w:p>
+    <w:p>
+      <w:pPr>
+        <w:pStyle w:val="Normal"/>
+        <w:bidi w:val="0"/>
+        <w:spacing w:lineRule="auto" w:line="360" w:before="0" w:after="120"/>
         <w:rPr>
           <w:rFonts w:ascii="Times New Roman" w:hAnsi="Times New Roman"/>
           <w:color w:val="000000"/>
@@ -2176,17 +2128,102 @@
       <w:r>
         <w:rPr>
           <w:rFonts w:eastAsia="Arial" w:cs="Arial" w:ascii="Times New Roman" w:hAnsi="Times New Roman"/>
-          <w:color w:val="000000"/>
-          <w:sz w:val="24"/>
-          <w:szCs w:val="24"/>
-        </w:rPr>
-        <w:t>Click Create a new menu. Type Main Menu as the name and click Create Menu.</w:t>
-      </w:r>
-    </w:p>
-    <w:p>
-      <w:pPr>
-        <w:pStyle w:val="Normal"/>
-        <w:spacing w:before="0" w:after="120"/>
+          <w:b w:val="false"/>
+          <w:bCs w:val="false"/>
+          <w:color w:val="000000"/>
+          <w:sz w:val="24"/>
+          <w:szCs w:val="24"/>
+        </w:rPr>
+        <w:t xml:space="preserve">Click the three dots ⋮ next to Navigation </w:t>
+      </w:r>
+      <w:r>
+        <w:rPr>
+          <w:rFonts w:eastAsia="Arial" w:cs="Arial" w:ascii="Times New Roman" w:hAnsi="Times New Roman"/>
+          <w:b w:val="false"/>
+          <w:bCs w:val="false"/>
+          <w:color w:val="000000"/>
+          <w:sz w:val="24"/>
+          <w:szCs w:val="24"/>
+        </w:rPr>
+        <w:t>and create page (eg. About).</w:t>
+      </w:r>
+    </w:p>
+    <w:p>
+      <w:pPr>
+        <w:pStyle w:val="Normal"/>
+        <w:bidi w:val="0"/>
+        <w:spacing w:lineRule="auto" w:line="360" w:before="0" w:after="120"/>
+        <w:rPr>
+          <w:rFonts w:ascii="Times New Roman" w:hAnsi="Times New Roman" w:eastAsia="Arial" w:cs="Arial"/>
+          <w:b/>
+          <w:bCs/>
+          <w:color w:val="000000"/>
+          <w:sz w:val="24"/>
+          <w:szCs w:val="24"/>
+        </w:rPr>
+      </w:pPr>
+      <w:r>
+        <w:rPr>
+          <w:rFonts w:eastAsia="Arial" w:cs="Arial" w:ascii="Times New Roman" w:hAnsi="Times New Roman"/>
+          <w:b/>
+          <w:bCs/>
+          <w:color w:val="000000"/>
+          <w:sz w:val="24"/>
+          <w:szCs w:val="24"/>
+        </w:rPr>
+        <w:drawing>
+          <wp:anchor behindDoc="0" distT="0" distB="0" distL="0" distR="0" simplePos="0" locked="0" layoutInCell="0" allowOverlap="1" relativeHeight="13">
+            <wp:simplePos x="0" y="0"/>
+            <wp:positionH relativeFrom="column">
+              <wp:posOffset>-26035</wp:posOffset>
+            </wp:positionH>
+            <wp:positionV relativeFrom="paragraph">
+              <wp:posOffset>68580</wp:posOffset>
+            </wp:positionV>
+            <wp:extent cx="2741295" cy="2830830"/>
+            <wp:effectExtent l="0" t="0" r="0" b="0"/>
+            <wp:wrapTopAndBottom/>
+            <wp:docPr id="14" name="Image14" descr=""/>
+            <wp:cNvGraphicFramePr>
+              <a:graphicFrameLocks xmlns:a="http://schemas.openxmlformats.org/drawingml/2006/main" noChangeAspect="1"/>
+            </wp:cNvGraphicFramePr>
+            <a:graphic xmlns:a="http://schemas.openxmlformats.org/drawingml/2006/main">
+              <a:graphicData uri="http://schemas.openxmlformats.org/drawingml/2006/picture">
+                <pic:pic xmlns:pic="http://schemas.openxmlformats.org/drawingml/2006/picture">
+                  <pic:nvPicPr>
+                    <pic:cNvPr id="14" name="Image14" descr=""/>
+                    <pic:cNvPicPr>
+                      <a:picLocks noChangeAspect="1" noChangeArrowheads="1"/>
+                    </pic:cNvPicPr>
+                  </pic:nvPicPr>
+                  <pic:blipFill>
+                    <a:blip r:embed="rId15"/>
+                    <a:stretch>
+                      <a:fillRect/>
+                    </a:stretch>
+                  </pic:blipFill>
+                  <pic:spPr bwMode="auto">
+                    <a:xfrm>
+                      <a:off x="0" y="0"/>
+                      <a:ext cx="2741295" cy="2830830"/>
+                    </a:xfrm>
+                    <a:prstGeom prst="rect">
+                      <a:avLst/>
+                    </a:prstGeom>
+                    <a:noFill/>
+                  </pic:spPr>
+                </pic:pic>
+              </a:graphicData>
+            </a:graphic>
+          </wp:anchor>
+        </w:drawing>
+      </w:r>
+    </w:p>
+    <w:p>
+      <w:pPr>
+        <w:pStyle w:val="Normal"/>
+        <w:bidi w:val="0"/>
+        <w:spacing w:lineRule="auto" w:line="360" w:before="0" w:after="120"/>
         <w:rPr>
           <w:rFonts w:ascii="Times New Roman" w:hAnsi="Times New Roman"/>
           <w:color w:val="000000"/>
@@ -2203,99 +2240,81 @@
           <w:sz w:val="24"/>
           <w:szCs w:val="24"/>
         </w:rPr>
-        <w:t xml:space="preserve">Step 3: </w:t>
-      </w:r>
-      <w:r>
-        <w:rPr>
-          <w:rFonts w:eastAsia="Arial" w:cs="Arial" w:ascii="Times New Roman" w:hAnsi="Times New Roman"/>
-          <w:color w:val="000000"/>
-          <w:sz w:val="24"/>
-          <w:szCs w:val="24"/>
-        </w:rPr>
-        <w:t>On the left side, you will see Pages. Check the boxes next to Home, About, Contact (or whatever pages you have). Click Add to Menu.</w:t>
-      </w:r>
-    </w:p>
-    <w:p>
-      <w:pPr>
-        <w:pStyle w:val="Normal"/>
-        <w:spacing w:before="0" w:after="120"/>
+        <w:t>Step 3:</w:t>
+      </w:r>
+      <w:r>
+        <w:rPr>
+          <w:rFonts w:eastAsia="Arial" w:cs="Arial" w:ascii="Times New Roman" w:hAnsi="Times New Roman"/>
+          <w:b w:val="false"/>
+          <w:bCs w:val="false"/>
+          <w:color w:val="000000"/>
+          <w:sz w:val="24"/>
+          <w:szCs w:val="24"/>
+        </w:rPr>
+        <w:t xml:space="preserve"> The page gets added to the menu</w:t>
+      </w:r>
+    </w:p>
+    <w:p>
+      <w:pPr>
+        <w:pStyle w:val="Normal"/>
+        <w:spacing w:lineRule="auto" w:line="360" w:before="0" w:after="120"/>
+        <w:rPr>
+          <w:rFonts w:eastAsia="Arial" w:cs="Arial"/>
+        </w:rPr>
+      </w:pPr>
+      <w:r>
         <w:rPr>
           <w:rFonts w:ascii="Times New Roman" w:hAnsi="Times New Roman"/>
           <w:color w:val="000000"/>
           <w:sz w:val="24"/>
           <w:szCs w:val="24"/>
         </w:rPr>
-      </w:pPr>
-      <w:r>
-        <w:rPr>
-          <w:rFonts w:eastAsia="Arial" w:cs="Arial" w:ascii="Times New Roman" w:hAnsi="Times New Roman"/>
-          <w:b/>
-          <w:bCs/>
-          <w:color w:val="000000"/>
-          <w:sz w:val="24"/>
-          <w:szCs w:val="24"/>
-        </w:rPr>
-        <w:t xml:space="preserve">Step 4: </w:t>
-      </w:r>
-      <w:r>
-        <w:rPr>
-          <w:rFonts w:eastAsia="Arial" w:cs="Arial" w:ascii="Times New Roman" w:hAnsi="Times New Roman"/>
-          <w:color w:val="000000"/>
-          <w:sz w:val="24"/>
-          <w:szCs w:val="24"/>
-        </w:rPr>
-        <w:t>Under Menu Settings, check Primary Menu (or Header Menu) as the location. Click Save Menu.</w:t>
-      </w:r>
-    </w:p>
-    <w:p>
-      <w:pPr>
-        <w:pStyle w:val="Normal"/>
-        <w:spacing w:before="0" w:after="120"/>
-        <w:rPr>
-          <w:rFonts w:ascii="Times New Roman" w:hAnsi="Times New Roman"/>
-          <w:color w:val="000000"/>
-          <w:sz w:val="24"/>
-          <w:szCs w:val="24"/>
-        </w:rPr>
-      </w:pPr>
-      <w:r>
-        <w:rPr>
-          <w:rFonts w:eastAsia="Arial" w:cs="Arial" w:ascii="Times New Roman" w:hAnsi="Times New Roman"/>
-          <w:b/>
-          <w:bCs/>
-          <w:color w:val="000000"/>
-          <w:sz w:val="24"/>
-          <w:szCs w:val="24"/>
-        </w:rPr>
-        <w:t xml:space="preserve">Step 5: </w:t>
-      </w:r>
-      <w:r>
-        <w:rPr>
-          <w:rFonts w:eastAsia="Arial" w:cs="Arial" w:ascii="Times New Roman" w:hAnsi="Times New Roman"/>
-          <w:color w:val="000000"/>
-          <w:sz w:val="24"/>
-          <w:szCs w:val="24"/>
-        </w:rPr>
-        <w:t>Now visit your site in the browser. You will see the menu appear at the top.</w:t>
-      </w:r>
-    </w:p>
-    <w:p>
-      <w:pPr>
-        <w:pStyle w:val="Normal"/>
-        <w:rPr>
-          <w:rFonts w:ascii="Times New Roman" w:hAnsi="Times New Roman"/>
-          <w:color w:val="000000"/>
-          <w:sz w:val="24"/>
-          <w:szCs w:val="24"/>
-        </w:rPr>
-      </w:pPr>
-      <w:r>
-        <w:rPr>
-          <w:rFonts w:ascii="Times New Roman" w:hAnsi="Times New Roman"/>
-          <w:color w:val="000000"/>
-          <w:sz w:val="24"/>
-          <w:szCs w:val="24"/>
-        </w:rPr>
+        <w:drawing>
+          <wp:anchor behindDoc="0" distT="0" distB="0" distL="0" distR="0" simplePos="0" locked="0" layoutInCell="0" allowOverlap="1" relativeHeight="14">
+            <wp:simplePos x="0" y="0"/>
+            <wp:positionH relativeFrom="column">
+              <wp:posOffset>-2540</wp:posOffset>
+            </wp:positionH>
+            <wp:positionV relativeFrom="paragraph">
+              <wp:posOffset>25400</wp:posOffset>
+            </wp:positionV>
+            <wp:extent cx="4801870" cy="2628900"/>
+            <wp:effectExtent l="0" t="0" r="0" b="0"/>
+            <wp:wrapTopAndBottom/>
+            <wp:docPr id="15" name="Image15" descr=""/>
+            <wp:cNvGraphicFramePr>
+              <a:graphicFrameLocks xmlns:a="http://schemas.openxmlformats.org/drawingml/2006/main" noChangeAspect="1"/>
+            </wp:cNvGraphicFramePr>
+            <a:graphic xmlns:a="http://schemas.openxmlformats.org/drawingml/2006/main">
+              <a:graphicData uri="http://schemas.openxmlformats.org/drawingml/2006/picture">
+                <pic:pic xmlns:pic="http://schemas.openxmlformats.org/drawingml/2006/picture">
+                  <pic:nvPicPr>
+                    <pic:cNvPr id="15" name="Image15" descr=""/>
+                    <pic:cNvPicPr>
+                      <a:picLocks noChangeAspect="1" noChangeArrowheads="1"/>
+                    </pic:cNvPicPr>
+                  </pic:nvPicPr>
+                  <pic:blipFill>
+                    <a:blip r:embed="rId16"/>
+                    <a:stretch>
+                      <a:fillRect/>
+                    </a:stretch>
+                  </pic:blipFill>
+                  <pic:spPr bwMode="auto">
+                    <a:xfrm>
+                      <a:off x="0" y="0"/>
+                      <a:ext cx="4801870" cy="2628900"/>
+                    </a:xfrm>
+                    <a:prstGeom prst="rect">
+                      <a:avLst/>
+                    </a:prstGeom>
+                    <a:noFill/>
+                  </pic:spPr>
+                </pic:pic>
+              </a:graphicData>
+            </a:graphic>
+          </wp:anchor>
+        </w:drawing>
       </w:r>
       <w:r>
         <w:br w:type="page"/>
@@ -2304,7 +2323,7 @@
     <w:p>
       <w:pPr>
         <w:pStyle w:val="Normal"/>
-        <w:spacing w:before="0" w:after="120"/>
+        <w:spacing w:lineRule="auto" w:line="360" w:before="0" w:after="120"/>
         <w:rPr>
           <w:rFonts w:ascii="Times New Roman" w:hAnsi="Times New Roman"/>
           <w:color w:val="000000"/>
@@ -2327,7 +2346,7 @@
     <w:p>
       <w:pPr>
         <w:pStyle w:val="Normal"/>
-        <w:spacing w:before="0" w:after="240"/>
+        <w:spacing w:lineRule="auto" w:line="360" w:before="0" w:after="240"/>
         <w:rPr>
           <w:rFonts w:ascii="Times New Roman" w:hAnsi="Times New Roman"/>
           <w:color w:val="000000"/>
@@ -2342,13 +2361,13 @@
           <w:sz w:val="24"/>
           <w:szCs w:val="24"/>
         </w:rPr>
-        <w:t>Themes control how your WordPress site looks. Each theme has a specific set of files.</w:t>
-      </w:r>
-    </w:p>
-    <w:p>
-      <w:pPr>
-        <w:pStyle w:val="Normal"/>
-        <w:spacing w:before="0" w:after="120"/>
+        <w:t>Themes control how our WordPress site looks. Each theme has a specific set of files.</w:t>
+      </w:r>
+    </w:p>
+    <w:p>
+      <w:pPr>
+        <w:pStyle w:val="Normal"/>
+        <w:spacing w:lineRule="auto" w:line="360" w:before="0" w:after="120"/>
         <w:rPr>
           <w:rFonts w:ascii="Times New Roman" w:hAnsi="Times New Roman"/>
           <w:color w:val="000000"/>
@@ -2374,13 +2393,97 @@
           <w:sz w:val="24"/>
           <w:szCs w:val="24"/>
         </w:rPr>
-        <w:t>Open VS Code (or any code editor). Navigate to your WordPress folder → wp-content → themes. You will see the theme folders inside.</w:t>
-      </w:r>
-    </w:p>
-    <w:p>
-      <w:pPr>
-        <w:pStyle w:val="Normal"/>
-        <w:spacing w:before="0" w:after="120"/>
+        <w:t xml:space="preserve">Open VS Code. Navigate to WordPress folder → wp-content → themes. </w:t>
+      </w:r>
+      <w:r>
+        <w:rPr>
+          <w:rFonts w:eastAsia="Arial" w:cs="Arial" w:ascii="Times New Roman" w:hAnsi="Times New Roman"/>
+          <w:color w:val="000000"/>
+          <w:sz w:val="24"/>
+          <w:szCs w:val="24"/>
+        </w:rPr>
+        <w:t>We</w:t>
+      </w:r>
+      <w:r>
+        <w:rPr>
+          <w:rFonts w:eastAsia="Arial" w:cs="Arial" w:ascii="Times New Roman" w:hAnsi="Times New Roman"/>
+          <w:color w:val="000000"/>
+          <w:sz w:val="24"/>
+          <w:szCs w:val="24"/>
+        </w:rPr>
+        <w:t xml:space="preserve"> will see the theme folders inside.</w:t>
+      </w:r>
+    </w:p>
+    <w:p>
+      <w:pPr>
+        <w:pStyle w:val="Normal"/>
+        <w:spacing w:lineRule="auto" w:line="360" w:before="0" w:after="120"/>
+        <w:rPr>
+          <w:rFonts w:ascii="Times New Roman" w:hAnsi="Times New Roman" w:eastAsia="Arial" w:cs="Arial"/>
+          <w:color w:val="000000"/>
+          <w:sz w:val="24"/>
+          <w:szCs w:val="24"/>
+        </w:rPr>
+      </w:pPr>
+      <w:r>
+        <w:rPr>
+          <w:rFonts w:eastAsia="Arial" w:cs="Arial" w:ascii="Times New Roman" w:hAnsi="Times New Roman"/>
+          <w:color w:val="000000"/>
+          <w:sz w:val="24"/>
+          <w:szCs w:val="24"/>
+        </w:rPr>
+        <w:drawing>
+          <wp:anchor behindDoc="0" distT="0" distB="0" distL="0" distR="0" simplePos="0" locked="0" layoutInCell="0" allowOverlap="1" relativeHeight="20">
+            <wp:simplePos x="0" y="0"/>
+            <wp:positionH relativeFrom="column">
+              <wp:posOffset>-17780</wp:posOffset>
+            </wp:positionH>
+            <wp:positionV relativeFrom="paragraph">
+              <wp:posOffset>-58420</wp:posOffset>
+            </wp:positionV>
+            <wp:extent cx="4091305" cy="722630"/>
+            <wp:effectExtent l="0" t="0" r="0" b="0"/>
+            <wp:wrapTopAndBottom/>
+            <wp:docPr id="16" name="Image19" descr=""/>
+            <wp:cNvGraphicFramePr>
+              <a:graphicFrameLocks xmlns:a="http://schemas.openxmlformats.org/drawingml/2006/main" noChangeAspect="1"/>
+            </wp:cNvGraphicFramePr>
+            <a:graphic xmlns:a="http://schemas.openxmlformats.org/drawingml/2006/main">
+              <a:graphicData uri="http://schemas.openxmlformats.org/drawingml/2006/picture">
+                <pic:pic xmlns:pic="http://schemas.openxmlformats.org/drawingml/2006/picture">
+                  <pic:nvPicPr>
+                    <pic:cNvPr id="16" name="Image19" descr=""/>
+                    <pic:cNvPicPr>
+                      <a:picLocks noChangeAspect="1" noChangeArrowheads="1"/>
+                    </pic:cNvPicPr>
+                  </pic:nvPicPr>
+                  <pic:blipFill>
+                    <a:blip r:embed="rId17"/>
+                    <a:stretch>
+                      <a:fillRect/>
+                    </a:stretch>
+                  </pic:blipFill>
+                  <pic:spPr bwMode="auto">
+                    <a:xfrm>
+                      <a:off x="0" y="0"/>
+                      <a:ext cx="4091305" cy="722630"/>
+                    </a:xfrm>
+                    <a:prstGeom prst="rect">
+                      <a:avLst/>
+                    </a:prstGeom>
+                    <a:noFill/>
+                  </pic:spPr>
+                </pic:pic>
+              </a:graphicData>
+            </a:graphic>
+          </wp:anchor>
+        </w:drawing>
+      </w:r>
+    </w:p>
+    <w:p>
+      <w:pPr>
+        <w:pStyle w:val="Normal"/>
+        <w:spacing w:lineRule="auto" w:line="360" w:before="0" w:after="120"/>
         <w:rPr>
           <w:rFonts w:ascii="Times New Roman" w:hAnsi="Times New Roman"/>
           <w:color w:val="000000"/>
@@ -2406,13 +2509,97 @@
           <w:sz w:val="24"/>
           <w:szCs w:val="24"/>
         </w:rPr>
-        <w:t>Open one of the theme folders. You will see files like style.css, index.php, functions.php etc.</w:t>
-      </w:r>
-    </w:p>
-    <w:p>
-      <w:pPr>
-        <w:pStyle w:val="Normal"/>
-        <w:spacing w:before="0" w:after="120"/>
+        <w:t xml:space="preserve">Open one of the theme folders. </w:t>
+      </w:r>
+      <w:r>
+        <w:rPr>
+          <w:rFonts w:eastAsia="Arial" w:cs="Arial" w:ascii="Times New Roman" w:hAnsi="Times New Roman"/>
+          <w:color w:val="000000"/>
+          <w:sz w:val="24"/>
+          <w:szCs w:val="24"/>
+        </w:rPr>
+        <w:t>We</w:t>
+      </w:r>
+      <w:r>
+        <w:rPr>
+          <w:rFonts w:eastAsia="Arial" w:cs="Arial" w:ascii="Times New Roman" w:hAnsi="Times New Roman"/>
+          <w:color w:val="000000"/>
+          <w:sz w:val="24"/>
+          <w:szCs w:val="24"/>
+        </w:rPr>
+        <w:t xml:space="preserve"> will see files like style.css, index.php, functions.php etc.</w:t>
+      </w:r>
+    </w:p>
+    <w:p>
+      <w:pPr>
+        <w:pStyle w:val="Normal"/>
+        <w:spacing w:lineRule="auto" w:line="360" w:before="0" w:after="120"/>
+        <w:rPr>
+          <w:rFonts w:ascii="Times New Roman" w:hAnsi="Times New Roman" w:eastAsia="Arial" w:cs="Arial"/>
+          <w:color w:val="000000"/>
+          <w:sz w:val="24"/>
+          <w:szCs w:val="24"/>
+        </w:rPr>
+      </w:pPr>
+      <w:r>
+        <w:rPr>
+          <w:rFonts w:eastAsia="Arial" w:cs="Arial" w:ascii="Times New Roman" w:hAnsi="Times New Roman"/>
+          <w:color w:val="000000"/>
+          <w:sz w:val="24"/>
+          <w:szCs w:val="24"/>
+        </w:rPr>
+        <w:drawing>
+          <wp:anchor behindDoc="0" distT="0" distB="0" distL="0" distR="0" simplePos="0" locked="0" layoutInCell="0" allowOverlap="1" relativeHeight="15">
+            <wp:simplePos x="0" y="0"/>
+            <wp:positionH relativeFrom="column">
+              <wp:posOffset>15875</wp:posOffset>
+            </wp:positionH>
+            <wp:positionV relativeFrom="paragraph">
+              <wp:posOffset>635</wp:posOffset>
+            </wp:positionV>
+            <wp:extent cx="2244725" cy="5056505"/>
+            <wp:effectExtent l="0" t="0" r="0" b="0"/>
+            <wp:wrapTopAndBottom/>
+            <wp:docPr id="17" name="Image16" descr=""/>
+            <wp:cNvGraphicFramePr>
+              <a:graphicFrameLocks xmlns:a="http://schemas.openxmlformats.org/drawingml/2006/main" noChangeAspect="1"/>
+            </wp:cNvGraphicFramePr>
+            <a:graphic xmlns:a="http://schemas.openxmlformats.org/drawingml/2006/main">
+              <a:graphicData uri="http://schemas.openxmlformats.org/drawingml/2006/picture">
+                <pic:pic xmlns:pic="http://schemas.openxmlformats.org/drawingml/2006/picture">
+                  <pic:nvPicPr>
+                    <pic:cNvPr id="17" name="Image16" descr=""/>
+                    <pic:cNvPicPr>
+                      <a:picLocks noChangeAspect="1" noChangeArrowheads="1"/>
+                    </pic:cNvPicPr>
+                  </pic:nvPicPr>
+                  <pic:blipFill>
+                    <a:blip r:embed="rId18"/>
+                    <a:stretch>
+                      <a:fillRect/>
+                    </a:stretch>
+                  </pic:blipFill>
+                  <pic:spPr bwMode="auto">
+                    <a:xfrm>
+                      <a:off x="0" y="0"/>
+                      <a:ext cx="2244725" cy="5056505"/>
+                    </a:xfrm>
+                    <a:prstGeom prst="rect">
+                      <a:avLst/>
+                    </a:prstGeom>
+                    <a:noFill/>
+                  </pic:spPr>
+                </pic:pic>
+              </a:graphicData>
+            </a:graphic>
+          </wp:anchor>
+        </w:drawing>
+      </w:r>
+    </w:p>
+    <w:p>
+      <w:pPr>
+        <w:pStyle w:val="Normal"/>
+        <w:spacing w:lineRule="auto" w:line="360" w:before="0" w:after="120"/>
         <w:rPr>
           <w:rFonts w:ascii="Times New Roman" w:hAnsi="Times New Roman"/>
           <w:color w:val="000000"/>
@@ -2438,54 +2625,715 @@
           <w:sz w:val="24"/>
           <w:szCs w:val="24"/>
         </w:rPr>
-        <w:t>Open style.css. At the top you will see the theme name, author, and version written as comments.</w:t>
-      </w:r>
-    </w:p>
-    <w:p>
-      <w:pPr>
-        <w:pStyle w:val="Normal"/>
-        <w:spacing w:before="0" w:after="120"/>
-        <w:rPr>
-          <w:rFonts w:eastAsia="Arial" w:cs="Arial"/>
-          <w:i/>
+        <w:t xml:space="preserve">Open style.css. At the top </w:t>
+      </w:r>
+      <w:r>
+        <w:rPr>
+          <w:rFonts w:eastAsia="Arial" w:cs="Arial" w:ascii="Times New Roman" w:hAnsi="Times New Roman"/>
+          <w:color w:val="000000"/>
+          <w:sz w:val="24"/>
+          <w:szCs w:val="24"/>
+        </w:rPr>
+        <w:t>we</w:t>
+      </w:r>
+      <w:r>
+        <w:rPr>
+          <w:rFonts w:eastAsia="Arial" w:cs="Arial" w:ascii="Times New Roman" w:hAnsi="Times New Roman"/>
+          <w:color w:val="000000"/>
+          <w:sz w:val="24"/>
+          <w:szCs w:val="24"/>
+        </w:rPr>
+        <w:t xml:space="preserve"> will see the theme name, author, and version written as comments.</w:t>
+      </w:r>
+    </w:p>
+    <w:p>
+      <w:pPr>
+        <w:pStyle w:val="Normal"/>
+        <w:spacing w:lineRule="auto" w:line="360" w:before="0" w:after="120"/>
+        <w:rPr>
+          <w:rFonts w:ascii="Times New Roman" w:hAnsi="Times New Roman" w:eastAsia="Arial" w:cs="Arial"/>
+          <w:color w:val="000000"/>
+          <w:sz w:val="24"/>
+          <w:szCs w:val="24"/>
+        </w:rPr>
+      </w:pPr>
+      <w:r>
+        <w:rPr>
+          <w:rFonts w:eastAsia="Arial" w:cs="Arial" w:ascii="Times New Roman" w:hAnsi="Times New Roman"/>
+          <w:color w:val="000000"/>
+          <w:sz w:val="24"/>
+          <w:szCs w:val="24"/>
+        </w:rPr>
+        <w:drawing>
+          <wp:anchor behindDoc="0" distT="0" distB="0" distL="0" distR="0" simplePos="0" locked="0" layoutInCell="0" allowOverlap="1" relativeHeight="16">
+            <wp:simplePos x="0" y="0"/>
+            <wp:positionH relativeFrom="column">
+              <wp:align>center</wp:align>
+            </wp:positionH>
+            <wp:positionV relativeFrom="paragraph">
+              <wp:posOffset>635</wp:posOffset>
+            </wp:positionV>
+            <wp:extent cx="5943600" cy="3274060"/>
+            <wp:effectExtent l="0" t="0" r="0" b="0"/>
+            <wp:wrapSquare wrapText="largest"/>
+            <wp:docPr id="18" name="Image17" descr=""/>
+            <wp:cNvGraphicFramePr>
+              <a:graphicFrameLocks xmlns:a="http://schemas.openxmlformats.org/drawingml/2006/main" noChangeAspect="1"/>
+            </wp:cNvGraphicFramePr>
+            <a:graphic xmlns:a="http://schemas.openxmlformats.org/drawingml/2006/main">
+              <a:graphicData uri="http://schemas.openxmlformats.org/drawingml/2006/picture">
+                <pic:pic xmlns:pic="http://schemas.openxmlformats.org/drawingml/2006/picture">
+                  <pic:nvPicPr>
+                    <pic:cNvPr id="18" name="Image17" descr=""/>
+                    <pic:cNvPicPr>
+                      <a:picLocks noChangeAspect="1" noChangeArrowheads="1"/>
+                    </pic:cNvPicPr>
+                  </pic:nvPicPr>
+                  <pic:blipFill>
+                    <a:blip r:embed="rId19"/>
+                    <a:stretch>
+                      <a:fillRect/>
+                    </a:stretch>
+                  </pic:blipFill>
+                  <pic:spPr bwMode="auto">
+                    <a:xfrm>
+                      <a:off x="0" y="0"/>
+                      <a:ext cx="5943600" cy="3274060"/>
+                    </a:xfrm>
+                    <a:prstGeom prst="rect">
+                      <a:avLst/>
+                    </a:prstGeom>
+                    <a:noFill/>
+                  </pic:spPr>
+                </pic:pic>
+              </a:graphicData>
+            </a:graphic>
+          </wp:anchor>
+        </w:drawing>
+      </w:r>
+    </w:p>
+    <w:p>
+      <w:pPr>
+        <w:pStyle w:val="Normal"/>
+        <w:bidi w:val="0"/>
+        <w:spacing w:lineRule="auto" w:line="360" w:before="0" w:after="120"/>
+        <w:rPr>
+          <w:rFonts w:ascii="Times New Roman" w:hAnsi="Times New Roman" w:eastAsia="Arial" w:cs="Arial"/>
+          <w:color w:val="000000"/>
+          <w:sz w:val="24"/>
+          <w:szCs w:val="24"/>
+        </w:rPr>
+      </w:pPr>
+      <w:r>
+        <w:rPr>
+          <w:rFonts w:eastAsia="Arial" w:cs="Arial" w:ascii="Times New Roman" w:hAnsi="Times New Roman"/>
+          <w:color w:val="000000"/>
+          <w:sz w:val="24"/>
+          <w:szCs w:val="24"/>
+        </w:rPr>
+      </w:r>
+      <w:r>
+        <w:br w:type="page"/>
+      </w:r>
+    </w:p>
+    <w:p>
+      <w:pPr>
+        <w:pStyle w:val="Normal"/>
+        <w:bidi w:val="0"/>
+        <w:spacing w:lineRule="auto" w:line="360" w:before="0" w:after="120"/>
+        <w:rPr>
+          <w:rFonts w:ascii="Times New Roman" w:hAnsi="Times New Roman" w:eastAsia="Arial" w:cs="Arial"/>
+          <w:b/>
+          <w:bCs/>
+          <w:color w:val="000000"/>
+          <w:sz w:val="28"/>
+          <w:szCs w:val="28"/>
+        </w:rPr>
+      </w:pPr>
+      <w:r>
+        <w:rPr>
+          <w:rFonts w:eastAsia="Arial" w:cs="Arial" w:ascii="Times New Roman" w:hAnsi="Times New Roman"/>
+          <w:b/>
+          <w:bCs/>
+          <w:color w:val="000000"/>
+          <w:sz w:val="28"/>
+          <w:szCs w:val="28"/>
+        </w:rPr>
+        <w:t>Theme File Structure - What I Understood</w:t>
+      </w:r>
+    </w:p>
+    <w:p>
+      <w:pPr>
+        <w:pStyle w:val="Normal"/>
+        <w:bidi w:val="0"/>
+        <w:spacing w:lineRule="auto" w:line="360" w:before="0" w:after="120"/>
+        <w:rPr>
+          <w:rFonts w:ascii="Times New Roman" w:hAnsi="Times New Roman" w:eastAsia="Arial" w:cs="Arial"/>
+          <w:color w:val="000000"/>
+          <w:sz w:val="24"/>
+          <w:szCs w:val="24"/>
+        </w:rPr>
+      </w:pPr>
+      <w:r>
+        <w:rPr>
+          <w:rFonts w:eastAsia="Arial" w:cs="Arial" w:ascii="Times New Roman" w:hAnsi="Times New Roman"/>
+          <w:color w:val="000000"/>
+          <w:sz w:val="24"/>
+          <w:szCs w:val="24"/>
+        </w:rPr>
+        <w:t>A WordPress theme controls how a website looks, not the content. So even if we change the theme, all posts and pages stay the same. All theme files are stored inside wp-content/themes/ folder. Each theme has its own folder inside there.</w:t>
+      </w:r>
+    </w:p>
+    <w:p>
+      <w:pPr>
+        <w:pStyle w:val="Normal"/>
+        <w:bidi w:val="0"/>
+        <w:spacing w:lineRule="auto" w:line="360" w:before="0" w:after="120"/>
+        <w:rPr>
+          <w:rFonts w:ascii="Times New Roman" w:hAnsi="Times New Roman" w:eastAsia="Arial" w:cs="Arial"/>
+          <w:color w:val="000000"/>
+          <w:sz w:val="24"/>
+          <w:szCs w:val="24"/>
+        </w:rPr>
+      </w:pPr>
+      <w:r>
+        <w:rPr>
+          <w:rFonts w:eastAsia="Arial" w:cs="Arial" w:ascii="Times New Roman" w:hAnsi="Times New Roman"/>
+          <w:color w:val="000000"/>
+          <w:sz w:val="24"/>
+          <w:szCs w:val="24"/>
+        </w:rPr>
+        <w:br/>
+      </w:r>
+      <w:r>
+        <w:rPr>
+          <w:rFonts w:eastAsia="Arial" w:cs="Arial" w:ascii="Times New Roman" w:hAnsi="Times New Roman"/>
           <w:i/>
           <w:iCs/>
-        </w:rPr>
-      </w:pPr>
-      <w:r>
-        <w:rPr>
-          <w:rFonts w:eastAsia="Arial" w:cs="Arial" w:ascii="Times New Roman" w:hAnsi="Times New Roman"/>
-          <w:b/>
-          <w:bCs/>
-          <w:color w:val="000000"/>
-          <w:sz w:val="24"/>
-          <w:szCs w:val="24"/>
-        </w:rPr>
-        <w:t xml:space="preserve">Step 4: </w:t>
-      </w:r>
-      <w:r>
-        <w:rPr>
-          <w:rFonts w:eastAsia="Arial" w:cs="Arial" w:ascii="Times New Roman" w:hAnsi="Times New Roman"/>
-          <w:color w:val="000000"/>
-          <w:sz w:val="24"/>
-          <w:szCs w:val="24"/>
-        </w:rPr>
-        <w:t>Open your browser and go to wphierarchy.com. This site shows how WordPress picks which template file to use.</w:t>
-      </w:r>
-    </w:p>
-    <w:p>
-      <w:pPr>
-        <w:pStyle w:val="Normal"/>
-        <w:spacing w:before="0" w:after="160"/>
-        <w:rPr/>
-      </w:pPr>
-      <w:r>
-        <w:rPr>
-          <w:rFonts w:ascii="Times New Roman" w:hAnsi="Times New Roman"/>
-          <w:color w:val="000000"/>
-          <w:sz w:val="24"/>
-          <w:szCs w:val="24"/>
-        </w:rPr>
+          <w:color w:val="000000"/>
+          <w:sz w:val="24"/>
+          <w:szCs w:val="24"/>
+        </w:rPr>
+        <w:t>The main files and what they do:</w:t>
+      </w:r>
+      <w:r>
+        <w:rPr>
+          <w:rFonts w:eastAsia="Arial" w:cs="Arial" w:ascii="Times New Roman" w:hAnsi="Times New Roman"/>
+          <w:color w:val="000000"/>
+          <w:sz w:val="24"/>
+          <w:szCs w:val="24"/>
+        </w:rPr>
+        <w:br/>
+      </w:r>
+      <w:r>
+        <w:rPr>
+          <w:rFonts w:eastAsia="Arial" w:cs="Arial" w:ascii="Times New Roman" w:hAnsi="Times New Roman"/>
+          <w:b/>
+          <w:bCs/>
+          <w:color w:val="000000"/>
+          <w:sz w:val="24"/>
+          <w:szCs w:val="24"/>
+        </w:rPr>
+        <w:t>style.css</w:t>
+      </w:r>
+      <w:r>
+        <w:rPr>
+          <w:rFonts w:eastAsia="Arial" w:cs="Arial" w:ascii="Times New Roman" w:hAnsi="Times New Roman"/>
+          <w:color w:val="000000"/>
+          <w:sz w:val="24"/>
+          <w:szCs w:val="24"/>
+        </w:rPr>
+        <w:t xml:space="preserve"> - The main stylesheet of the theme. At the very top it contains the theme name, author, and version as a comment. WordPress reads this to identify the theme. All CSS styling is written below that.</w:t>
+        <w:br/>
+      </w:r>
+      <w:r>
+        <w:rPr>
+          <w:rFonts w:eastAsia="Arial" w:cs="Arial" w:ascii="Times New Roman" w:hAnsi="Times New Roman"/>
+          <w:b/>
+          <w:bCs/>
+          <w:color w:val="000000"/>
+          <w:sz w:val="24"/>
+          <w:szCs w:val="24"/>
+        </w:rPr>
+        <w:t>functions.php</w:t>
+      </w:r>
+      <w:r>
+        <w:rPr>
+          <w:rFonts w:eastAsia="Arial" w:cs="Arial" w:ascii="Times New Roman" w:hAnsi="Times New Roman"/>
+          <w:color w:val="000000"/>
+          <w:sz w:val="24"/>
+          <w:szCs w:val="24"/>
+        </w:rPr>
+        <w:t xml:space="preserve"> - Works like a plugin for the theme. Used to add features like registering menus, loading scripts, and enabling theme support.</w:t>
+        <w:br/>
+      </w:r>
+      <w:r>
+        <w:rPr>
+          <w:rFonts w:eastAsia="Arial" w:cs="Arial" w:ascii="Times New Roman" w:hAnsi="Times New Roman"/>
+          <w:b/>
+          <w:bCs/>
+          <w:color w:val="000000"/>
+          <w:sz w:val="24"/>
+          <w:szCs w:val="24"/>
+        </w:rPr>
+        <w:t>index.php</w:t>
+      </w:r>
+      <w:r>
+        <w:rPr>
+          <w:rFonts w:eastAsia="Arial" w:cs="Arial" w:ascii="Times New Roman" w:hAnsi="Times New Roman"/>
+          <w:color w:val="000000"/>
+          <w:sz w:val="24"/>
+          <w:szCs w:val="24"/>
+        </w:rPr>
+        <w:t xml:space="preserve"> - The main fallback template. If WordPress </w:t>
+      </w:r>
+      <w:r>
+        <w:rPr>
+          <w:rFonts w:eastAsia="Arial" w:cs="Arial" w:ascii="Times New Roman" w:hAnsi="Times New Roman"/>
+          <w:color w:val="000000"/>
+          <w:sz w:val="24"/>
+          <w:szCs w:val="24"/>
+        </w:rPr>
+        <w:t>can’t</w:t>
+      </w:r>
+      <w:r>
+        <w:rPr>
+          <w:rFonts w:eastAsia="Arial" w:cs="Arial" w:ascii="Times New Roman" w:hAnsi="Times New Roman"/>
+          <w:color w:val="000000"/>
+          <w:sz w:val="24"/>
+          <w:szCs w:val="24"/>
+        </w:rPr>
+        <w:t xml:space="preserve"> find any other matching file, it always uses this one.</w:t>
+        <w:br/>
+      </w:r>
+      <w:r>
+        <w:rPr>
+          <w:rFonts w:eastAsia="Arial" w:cs="Arial" w:ascii="Times New Roman" w:hAnsi="Times New Roman"/>
+          <w:b/>
+          <w:bCs/>
+          <w:color w:val="000000"/>
+          <w:sz w:val="24"/>
+          <w:szCs w:val="24"/>
+        </w:rPr>
+        <w:t>templates folder</w:t>
+      </w:r>
+      <w:r>
+        <w:rPr>
+          <w:rFonts w:eastAsia="Arial" w:cs="Arial" w:ascii="Times New Roman" w:hAnsi="Times New Roman"/>
+          <w:color w:val="000000"/>
+          <w:sz w:val="24"/>
+          <w:szCs w:val="24"/>
+        </w:rPr>
+        <w:t xml:space="preserve"> - Contains different template files for different pages like home, single post, archive etc.</w:t>
+        <w:br/>
+      </w:r>
+      <w:r>
+        <w:rPr>
+          <w:rFonts w:eastAsia="Arial" w:cs="Arial" w:ascii="Times New Roman" w:hAnsi="Times New Roman"/>
+          <w:b/>
+          <w:bCs/>
+          <w:color w:val="000000"/>
+          <w:sz w:val="24"/>
+          <w:szCs w:val="24"/>
+        </w:rPr>
+        <w:t>parts folder</w:t>
+      </w:r>
+      <w:r>
+        <w:rPr>
+          <w:rFonts w:eastAsia="Arial" w:cs="Arial" w:ascii="Times New Roman" w:hAnsi="Times New Roman"/>
+          <w:color w:val="000000"/>
+          <w:sz w:val="24"/>
+          <w:szCs w:val="24"/>
+        </w:rPr>
+        <w:t xml:space="preserve"> - Contains smaller reusable pieces like header and footer that are used inside the bigger templates.</w:t>
+        <w:br/>
+      </w:r>
+      <w:r>
+        <w:rPr>
+          <w:rFonts w:eastAsia="Arial" w:cs="Arial" w:ascii="Times New Roman" w:hAnsi="Times New Roman"/>
+          <w:b/>
+          <w:bCs/>
+          <w:color w:val="000000"/>
+          <w:sz w:val="24"/>
+          <w:szCs w:val="24"/>
+        </w:rPr>
+        <w:t>theme.json</w:t>
+      </w:r>
+      <w:r>
+        <w:rPr>
+          <w:rFonts w:eastAsia="Arial" w:cs="Arial" w:ascii="Times New Roman" w:hAnsi="Times New Roman"/>
+          <w:color w:val="000000"/>
+          <w:sz w:val="24"/>
+          <w:szCs w:val="24"/>
+        </w:rPr>
+        <w:t xml:space="preserve"> - Controls global settings like colors, fonts, and spacing. Used in modern Full Site Editing themes like Twenty Twenty Five.</w:t>
+        <w:br/>
+      </w:r>
+      <w:r>
+        <w:br w:type="page"/>
+      </w:r>
+    </w:p>
+    <w:p>
+      <w:pPr>
+        <w:pStyle w:val="Normal"/>
+        <w:bidi w:val="0"/>
+        <w:spacing w:lineRule="auto" w:line="360" w:before="0" w:after="120"/>
+        <w:rPr>
+          <w:rFonts w:ascii="Times New Roman" w:hAnsi="Times New Roman" w:eastAsia="Arial" w:cs="Arial"/>
+          <w:b/>
+          <w:bCs/>
+          <w:color w:val="000000"/>
+          <w:sz w:val="28"/>
+          <w:szCs w:val="28"/>
+        </w:rPr>
+      </w:pPr>
+      <w:r>
+        <w:rPr>
+          <w:rFonts w:eastAsia="Arial" w:cs="Arial" w:ascii="Times New Roman" w:hAnsi="Times New Roman"/>
+          <w:b/>
+          <w:bCs/>
+          <w:color w:val="000000"/>
+          <w:sz w:val="28"/>
+          <w:szCs w:val="28"/>
+        </w:rPr>
+        <w:t>Template Hierarchy - What I Understood</w:t>
+      </w:r>
+    </w:p>
+    <w:p>
+      <w:pPr>
+        <w:pStyle w:val="Normal"/>
+        <w:bidi w:val="0"/>
+        <w:spacing w:lineRule="auto" w:line="360" w:before="0" w:after="120"/>
+        <w:rPr>
+          <w:rFonts w:ascii="Times New Roman" w:hAnsi="Times New Roman" w:eastAsia="Arial" w:cs="Arial"/>
+          <w:color w:val="000000"/>
+          <w:sz w:val="24"/>
+          <w:szCs w:val="24"/>
+        </w:rPr>
+      </w:pPr>
+      <w:r>
+        <w:rPr>
+          <w:rFonts w:eastAsia="Arial" w:cs="Arial" w:ascii="Times New Roman" w:hAnsi="Times New Roman"/>
+          <w:color w:val="000000"/>
+          <w:sz w:val="24"/>
+          <w:szCs w:val="24"/>
+        </w:rPr>
+        <w:t>Template hierarchy is the system WordPress uses to decide which template file to load. It always looks for the most specific file first. If that file does</w:t>
+      </w:r>
+      <w:r>
+        <w:rPr>
+          <w:rFonts w:eastAsia="Arial" w:cs="Arial" w:ascii="Times New Roman" w:hAnsi="Times New Roman"/>
+          <w:color w:val="000000"/>
+          <w:sz w:val="24"/>
+          <w:szCs w:val="24"/>
+        </w:rPr>
+        <w:t>n’t</w:t>
+      </w:r>
+      <w:r>
+        <w:rPr>
+          <w:rFonts w:eastAsia="Arial" w:cs="Arial" w:ascii="Times New Roman" w:hAnsi="Times New Roman"/>
+          <w:color w:val="000000"/>
+          <w:sz w:val="24"/>
+          <w:szCs w:val="24"/>
+        </w:rPr>
+        <w:t xml:space="preserve"> exist, it moves to the next one. This continues until it finds a match. If nothing matches, it always falls back to index.php.</w:t>
+      </w:r>
+    </w:p>
+    <w:p>
+      <w:pPr>
+        <w:pStyle w:val="Normal"/>
+        <w:bidi w:val="0"/>
+        <w:spacing w:lineRule="auto" w:line="360" w:before="0" w:after="120"/>
+        <w:rPr>
+          <w:rFonts w:ascii="Times New Roman" w:hAnsi="Times New Roman" w:eastAsia="Arial" w:cs="Arial"/>
+          <w:color w:val="000000"/>
+          <w:sz w:val="24"/>
+          <w:szCs w:val="24"/>
+        </w:rPr>
+      </w:pPr>
+      <w:r>
+        <w:rPr>
+          <w:rFonts w:eastAsia="Arial" w:cs="Arial" w:ascii="Times New Roman" w:hAnsi="Times New Roman"/>
+          <w:color w:val="000000"/>
+          <w:sz w:val="24"/>
+          <w:szCs w:val="24"/>
+        </w:rPr>
+        <w:t xml:space="preserve">i. </w:t>
+      </w:r>
+      <w:r>
+        <w:rPr>
+          <w:rFonts w:eastAsia="Arial" w:cs="Arial" w:ascii="Times New Roman" w:hAnsi="Times New Roman"/>
+          <w:color w:val="000000"/>
+          <w:sz w:val="24"/>
+          <w:szCs w:val="24"/>
+        </w:rPr>
+        <w:t xml:space="preserve">For example for a </w:t>
+      </w:r>
+      <w:r>
+        <w:rPr>
+          <w:rFonts w:eastAsia="Arial" w:cs="Arial" w:ascii="Times New Roman" w:hAnsi="Times New Roman"/>
+          <w:b/>
+          <w:bCs/>
+          <w:color w:val="000000"/>
+          <w:sz w:val="24"/>
+          <w:szCs w:val="24"/>
+        </w:rPr>
+        <w:t>single post</w:t>
+      </w:r>
+      <w:r>
+        <w:rPr>
+          <w:rFonts w:eastAsia="Arial" w:cs="Arial" w:ascii="Times New Roman" w:hAnsi="Times New Roman"/>
+          <w:color w:val="000000"/>
+          <w:sz w:val="24"/>
+          <w:szCs w:val="24"/>
+        </w:rPr>
+        <w:t xml:space="preserve"> it checks:</w:t>
+        <w:br/>
+        <w:t>single-{post-type}.php → single.php → index.php</w:t>
+      </w:r>
+    </w:p>
+    <w:p>
+      <w:pPr>
+        <w:pStyle w:val="Normal"/>
+        <w:bidi w:val="0"/>
+        <w:spacing w:lineRule="auto" w:line="360" w:before="0" w:after="120"/>
+        <w:rPr>
+          <w:rFonts w:ascii="Times New Roman" w:hAnsi="Times New Roman" w:eastAsia="Arial" w:cs="Arial"/>
+          <w:color w:val="000000"/>
+          <w:sz w:val="24"/>
+          <w:szCs w:val="24"/>
+        </w:rPr>
+      </w:pPr>
+      <w:r>
+        <w:rPr>
+          <w:rFonts w:eastAsia="Arial" w:cs="Arial" w:ascii="Times New Roman" w:hAnsi="Times New Roman"/>
+          <w:color w:val="000000"/>
+          <w:sz w:val="24"/>
+          <w:szCs w:val="24"/>
+        </w:rPr>
+        <w:t xml:space="preserve">ii. </w:t>
+      </w:r>
+      <w:r>
+        <w:rPr>
+          <w:rFonts w:eastAsia="Arial" w:cs="Arial" w:ascii="Times New Roman" w:hAnsi="Times New Roman"/>
+          <w:color w:val="000000"/>
+          <w:sz w:val="24"/>
+          <w:szCs w:val="24"/>
+        </w:rPr>
+        <w:t xml:space="preserve">For a </w:t>
+      </w:r>
+      <w:r>
+        <w:rPr>
+          <w:rFonts w:eastAsia="Arial" w:cs="Arial" w:ascii="Times New Roman" w:hAnsi="Times New Roman"/>
+          <w:b/>
+          <w:bCs/>
+          <w:color w:val="000000"/>
+          <w:sz w:val="24"/>
+          <w:szCs w:val="24"/>
+        </w:rPr>
+        <w:t>page</w:t>
+      </w:r>
+      <w:r>
+        <w:rPr>
+          <w:rFonts w:eastAsia="Arial" w:cs="Arial" w:ascii="Times New Roman" w:hAnsi="Times New Roman"/>
+          <w:color w:val="000000"/>
+          <w:sz w:val="24"/>
+          <w:szCs w:val="24"/>
+        </w:rPr>
+        <w:t xml:space="preserve"> it checks:</w:t>
+        <w:br/>
+        <w:t>page-{slug}.php → page-{id}.php → page.php → index.php</w:t>
+      </w:r>
+    </w:p>
+    <w:p>
+      <w:pPr>
+        <w:pStyle w:val="Normal"/>
+        <w:bidi w:val="0"/>
+        <w:spacing w:lineRule="auto" w:line="360" w:before="0" w:after="120"/>
+        <w:rPr>
+          <w:rFonts w:ascii="Times New Roman" w:hAnsi="Times New Roman" w:eastAsia="Arial" w:cs="Arial"/>
+          <w:color w:val="000000"/>
+          <w:sz w:val="24"/>
+          <w:szCs w:val="24"/>
+        </w:rPr>
+      </w:pPr>
+      <w:r>
+        <w:rPr>
+          <w:rFonts w:eastAsia="Arial" w:cs="Arial" w:ascii="Times New Roman" w:hAnsi="Times New Roman"/>
+          <w:color w:val="000000"/>
+          <w:sz w:val="24"/>
+          <w:szCs w:val="24"/>
+        </w:rPr>
+        <w:t xml:space="preserve">iii. </w:t>
+      </w:r>
+      <w:r>
+        <w:rPr>
+          <w:rFonts w:eastAsia="Arial" w:cs="Arial" w:ascii="Times New Roman" w:hAnsi="Times New Roman"/>
+          <w:color w:val="000000"/>
+          <w:sz w:val="24"/>
+          <w:szCs w:val="24"/>
+        </w:rPr>
+        <w:t xml:space="preserve">For a </w:t>
+      </w:r>
+      <w:r>
+        <w:rPr>
+          <w:rFonts w:eastAsia="Arial" w:cs="Arial" w:ascii="Times New Roman" w:hAnsi="Times New Roman"/>
+          <w:b/>
+          <w:bCs/>
+          <w:color w:val="000000"/>
+          <w:sz w:val="24"/>
+          <w:szCs w:val="24"/>
+        </w:rPr>
+        <w:t>category</w:t>
+      </w:r>
+      <w:r>
+        <w:rPr>
+          <w:rFonts w:eastAsia="Arial" w:cs="Arial" w:ascii="Times New Roman" w:hAnsi="Times New Roman"/>
+          <w:color w:val="000000"/>
+          <w:sz w:val="24"/>
+          <w:szCs w:val="24"/>
+        </w:rPr>
+        <w:t xml:space="preserve"> it checks:</w:t>
+        <w:br/>
+        <w:t>category-{slug}.php → category.php → archive.php → index.php</w:t>
+      </w:r>
+    </w:p>
+    <w:p>
+      <w:pPr>
+        <w:pStyle w:val="Normal"/>
+        <w:bidi w:val="0"/>
+        <w:spacing w:lineRule="auto" w:line="360" w:before="0" w:after="120"/>
+        <w:rPr>
+          <w:rFonts w:ascii="Times New Roman" w:hAnsi="Times New Roman" w:eastAsia="Arial" w:cs="Arial"/>
+          <w:color w:val="000000"/>
+          <w:sz w:val="24"/>
+          <w:szCs w:val="24"/>
+        </w:rPr>
+      </w:pPr>
+      <w:r>
+        <w:rPr>
+          <w:rFonts w:eastAsia="Arial" w:cs="Arial" w:ascii="Times New Roman" w:hAnsi="Times New Roman"/>
+          <w:color w:val="000000"/>
+          <w:sz w:val="24"/>
+          <w:szCs w:val="24"/>
+        </w:rPr>
+        <w:br/>
+        <w:t xml:space="preserve">This system gives developers control to create specific templates for specific pages while still having a general fallback for everything else. </w:t>
+      </w:r>
+    </w:p>
+    <w:p>
+      <w:pPr>
+        <w:pStyle w:val="Normal"/>
+        <w:bidi w:val="0"/>
+        <w:spacing w:lineRule="auto" w:line="360" w:before="0" w:after="120"/>
+        <w:rPr>
+          <w:rFonts w:ascii="Times New Roman" w:hAnsi="Times New Roman" w:eastAsia="Arial" w:cs="Arial"/>
+          <w:color w:val="000000"/>
+          <w:sz w:val="24"/>
+          <w:szCs w:val="24"/>
+        </w:rPr>
+      </w:pPr>
+      <w:r>
+        <w:rPr>
+          <w:rFonts w:eastAsia="Arial" w:cs="Arial" w:ascii="Times New Roman" w:hAnsi="Times New Roman"/>
+          <w:color w:val="000000"/>
+          <w:sz w:val="24"/>
+          <w:szCs w:val="24"/>
+        </w:rPr>
+        <w:t xml:space="preserve">We can see the full visual diagram of this at </w:t>
+      </w:r>
+      <w:r>
+        <w:rPr>
+          <w:rFonts w:eastAsia="Arial" w:cs="Arial" w:ascii="Times New Roman" w:hAnsi="Times New Roman"/>
+          <w:b/>
+          <w:bCs/>
+          <w:color w:val="000000"/>
+          <w:sz w:val="24"/>
+          <w:szCs w:val="24"/>
+        </w:rPr>
+        <w:t>wphierarchy.com</w:t>
+      </w:r>
+      <w:r>
+        <w:rPr>
+          <w:rFonts w:eastAsia="Arial" w:cs="Arial" w:ascii="Times New Roman" w:hAnsi="Times New Roman"/>
+          <w:color w:val="000000"/>
+          <w:sz w:val="24"/>
+          <w:szCs w:val="24"/>
+        </w:rPr>
+        <w:t>.</w:t>
+      </w:r>
+    </w:p>
+    <w:p>
+      <w:pPr>
+        <w:pStyle w:val="Normal"/>
+        <w:bidi w:val="0"/>
+        <w:spacing w:lineRule="auto" w:line="360" w:before="0" w:after="120"/>
+        <w:rPr>
+          <w:rFonts w:eastAsia="Arial" w:cs="Arial"/>
+        </w:rPr>
+      </w:pPr>
+      <w:r>
+        <w:rPr>
+          <w:rFonts w:eastAsia="Arial" w:cs="Arial" w:ascii="Times New Roman" w:hAnsi="Times New Roman"/>
+          <w:color w:val="000000"/>
+          <w:sz w:val="24"/>
+          <w:szCs w:val="24"/>
+        </w:rPr>
+        <w:drawing>
+          <wp:anchor behindDoc="0" distT="0" distB="0" distL="0" distR="0" simplePos="0" locked="0" layoutInCell="0" allowOverlap="1" relativeHeight="17">
+            <wp:simplePos x="0" y="0"/>
+            <wp:positionH relativeFrom="column">
+              <wp:posOffset>26670</wp:posOffset>
+            </wp:positionH>
+            <wp:positionV relativeFrom="paragraph">
+              <wp:posOffset>-72390</wp:posOffset>
+            </wp:positionV>
+            <wp:extent cx="5692140" cy="3956685"/>
+            <wp:effectExtent l="0" t="0" r="0" b="0"/>
+            <wp:wrapSquare wrapText="largest"/>
+            <wp:docPr id="19" name="Image18" descr=""/>
+            <wp:cNvGraphicFramePr>
+              <a:graphicFrameLocks xmlns:a="http://schemas.openxmlformats.org/drawingml/2006/main" noChangeAspect="1"/>
+            </wp:cNvGraphicFramePr>
+            <a:graphic xmlns:a="http://schemas.openxmlformats.org/drawingml/2006/main">
+              <a:graphicData uri="http://schemas.openxmlformats.org/drawingml/2006/picture">
+                <pic:pic xmlns:pic="http://schemas.openxmlformats.org/drawingml/2006/picture">
+                  <pic:nvPicPr>
+                    <pic:cNvPr id="19" name="Image18" descr=""/>
+                    <pic:cNvPicPr>
+                      <a:picLocks noChangeAspect="1" noChangeArrowheads="1"/>
+                    </pic:cNvPicPr>
+                  </pic:nvPicPr>
+                  <pic:blipFill>
+                    <a:blip r:embed="rId20"/>
+                    <a:stretch>
+                      <a:fillRect/>
+                    </a:stretch>
+                  </pic:blipFill>
+                  <pic:spPr bwMode="auto">
+                    <a:xfrm>
+                      <a:off x="0" y="0"/>
+                      <a:ext cx="5692140" cy="3956685"/>
+                    </a:xfrm>
+                    <a:prstGeom prst="rect">
+                      <a:avLst/>
+                    </a:prstGeom>
+                    <a:noFill/>
+                  </pic:spPr>
+                </pic:pic>
+              </a:graphicData>
+            </a:graphic>
+          </wp:anchor>
+        </w:drawing>
+      </w:r>
+      <w:r>
+        <w:rPr>
+          <w:rFonts w:eastAsia="Arial" w:cs="Arial" w:ascii="Times New Roman" w:hAnsi="Times New Roman"/>
+          <w:color w:val="000000"/>
+          <w:sz w:val="24"/>
+          <w:szCs w:val="24"/>
+        </w:rPr>
+        <w:br/>
       </w:r>
     </w:p>
     <w:sectPr>
@@ -2667,6 +3515,14 @@
     <w:rPr>
       <w:sz w:val="20"/>
       <w:szCs w:val="20"/>
+    </w:rPr>
+  </w:style>
+  <w:style w:type="character" w:styleId="Strong">
+    <w:name w:val="Strong"/>
+    <w:qFormat/>
+    <w:rPr>
+      <w:b/>
+      <w:bCs/>
     </w:rPr>
   </w:style>
   <w:style w:type="paragraph" w:styleId="Heading">

</xml_diff>